<commit_message>
Fix table parsing bug in converter and update DOCX explanations report with native tables
</commit_message>
<xml_diff>
--- a/cleaning/VISUALIZATION_EXPLANATIONS.docx
+++ b/cleaning/VISUALIZATION_EXPLANATIONS.docx
@@ -58,158 +58,797 @@
         <w:t>Table 3.1: Group Means and Standard Errors (Clove Run)</w:t>
       </w:r>
     </w:p>
-    <w:p>
-      <w:pPr>
-        <w:spacing w:line="360" w:lineRule="auto" w:after="0"/>
-        <w:jc w:val="both"/>
-      </w:pPr>
-      <w:r>
-        <w:rPr>
-          <w:rFonts w:ascii="Times New Roman" w:hAnsi="Times New Roman" w:eastAsia="Times New Roman"/>
-          <w:color w:val="000000"/>
-          <w:sz w:val="24"/>
-        </w:rPr>
-        <w:t>| Group | Prot (g/dL) | SOD (U/g Prot) | CAT (U/g Prot) | GPx (U/g Prot) | MDA (mol/g Prot) | Red. GSH (ug/mL) | TAC (ug/mL) |</w:t>
-      </w:r>
-    </w:p>
-    <w:p>
-      <w:pPr>
-        <w:spacing w:line="360" w:lineRule="auto" w:after="0"/>
-        <w:jc w:val="both"/>
-      </w:pPr>
-      <w:r>
-        <w:rPr>
-          <w:rFonts w:ascii="Times New Roman" w:hAnsi="Times New Roman" w:eastAsia="Times New Roman"/>
-          <w:color w:val="000000"/>
-          <w:sz w:val="24"/>
-        </w:rPr>
-        <w:t>| :--- | :---: | :---: | :---: | :---: | :---: | :---: | :---: |</w:t>
-      </w:r>
-    </w:p>
-    <w:p>
-      <w:pPr>
-        <w:spacing w:line="360" w:lineRule="auto" w:after="0"/>
-        <w:jc w:val="both"/>
-      </w:pPr>
-      <w:r>
-        <w:rPr>
-          <w:rFonts w:ascii="Times New Roman" w:hAnsi="Times New Roman" w:eastAsia="Times New Roman"/>
-          <w:color w:val="000000"/>
-          <w:sz w:val="24"/>
-        </w:rPr>
-        <w:t xml:space="preserve">| </w:t>
-      </w:r>
-      <w:r>
-        <w:rPr>
-          <w:rFonts w:ascii="Times New Roman" w:hAnsi="Times New Roman" w:eastAsia="Times New Roman"/>
-          <w:b/>
-          <w:color w:val="000000"/>
-          <w:sz w:val="24"/>
-        </w:rPr>
-        <w:t>NC</w:t>
-      </w:r>
-      <w:r>
-        <w:rPr>
-          <w:rFonts w:ascii="Times New Roman" w:hAnsi="Times New Roman" w:eastAsia="Times New Roman"/>
-          <w:color w:val="000000"/>
-          <w:sz w:val="24"/>
-        </w:rPr>
-        <w:t xml:space="preserve"> | 0.6356 ± 0.0154 | 1.6934 ± 0.0938 | 1.2774 ± 0.0437 | 2.5788 ± 0.2428 | 0.2991 ± 0.0584 | 70.0984 ± 0.6081 | 30.3469 ± 2.7154 |</w:t>
-      </w:r>
-    </w:p>
-    <w:p>
-      <w:pPr>
-        <w:spacing w:line="360" w:lineRule="auto" w:after="0"/>
-        <w:jc w:val="both"/>
-      </w:pPr>
-      <w:r>
-        <w:rPr>
-          <w:rFonts w:ascii="Times New Roman" w:hAnsi="Times New Roman" w:eastAsia="Times New Roman"/>
-          <w:color w:val="000000"/>
-          <w:sz w:val="24"/>
-        </w:rPr>
-        <w:t xml:space="preserve">| </w:t>
-      </w:r>
-      <w:r>
-        <w:rPr>
-          <w:rFonts w:ascii="Times New Roman" w:hAnsi="Times New Roman" w:eastAsia="Times New Roman"/>
-          <w:b/>
-          <w:color w:val="000000"/>
-          <w:sz w:val="24"/>
-        </w:rPr>
-        <w:t>MC</w:t>
-      </w:r>
-      <w:r>
-        <w:rPr>
-          <w:rFonts w:ascii="Times New Roman" w:hAnsi="Times New Roman" w:eastAsia="Times New Roman"/>
-          <w:color w:val="000000"/>
-          <w:sz w:val="24"/>
-        </w:rPr>
-        <w:t xml:space="preserve"> | 0.7780 ± 0.0335 | 1.3108 ± 0.0594 | 0.9805 ± 0.0360 | 2.1189 ± 0.2278 | 0.1370 ± 0.0211 | 69.6393 ± 2.0439 | 38.1845 ± 2.9430 |</w:t>
-      </w:r>
-    </w:p>
-    <w:p>
-      <w:pPr>
-        <w:spacing w:line="360" w:lineRule="auto" w:after="0"/>
-        <w:jc w:val="both"/>
-      </w:pPr>
-      <w:r>
-        <w:rPr>
-          <w:rFonts w:ascii="Times New Roman" w:hAnsi="Times New Roman" w:eastAsia="Times New Roman"/>
-          <w:color w:val="000000"/>
-          <w:sz w:val="24"/>
-        </w:rPr>
-        <w:t xml:space="preserve">| </w:t>
-      </w:r>
-      <w:r>
-        <w:rPr>
-          <w:rFonts w:ascii="Times New Roman" w:hAnsi="Times New Roman" w:eastAsia="Times New Roman"/>
-          <w:b/>
-          <w:color w:val="000000"/>
-          <w:sz w:val="24"/>
-        </w:rPr>
-        <w:t>CL</w:t>
-      </w:r>
-      <w:r>
-        <w:rPr>
-          <w:rFonts w:ascii="Times New Roman" w:hAnsi="Times New Roman" w:eastAsia="Times New Roman"/>
-          <w:color w:val="000000"/>
-          <w:sz w:val="24"/>
-        </w:rPr>
-        <w:t xml:space="preserve"> | 0.9114 ± 0.0576 | 1.1535 ± 0.0764 | 0.8102 ± 0.0535 | 1.5567 ± 0.0970 | 0.4470 ± 0.0953 | 68.1196 ± 1.1053 | 37.4126 ± 2.5205 |</w:t>
-      </w:r>
-    </w:p>
-    <w:p>
-      <w:pPr>
-        <w:spacing w:line="360" w:lineRule="auto" w:after="0"/>
-        <w:jc w:val="both"/>
-      </w:pPr>
-      <w:r>
-        <w:rPr>
-          <w:rFonts w:ascii="Times New Roman" w:hAnsi="Times New Roman" w:eastAsia="Times New Roman"/>
-          <w:color w:val="000000"/>
-          <w:sz w:val="24"/>
-        </w:rPr>
-        <w:t xml:space="preserve">| </w:t>
-      </w:r>
-      <w:r>
-        <w:rPr>
-          <w:rFonts w:ascii="Times New Roman" w:hAnsi="Times New Roman" w:eastAsia="Times New Roman"/>
-          <w:b/>
-          <w:color w:val="000000"/>
-          <w:sz w:val="24"/>
-        </w:rPr>
-        <w:t>IB</w:t>
-      </w:r>
-      <w:r>
-        <w:rPr>
-          <w:rFonts w:ascii="Times New Roman" w:hAnsi="Times New Roman" w:eastAsia="Times New Roman"/>
-          <w:color w:val="000000"/>
-          <w:sz w:val="24"/>
-        </w:rPr>
-        <w:t xml:space="preserve"> | 0.8938 ± 0.1002 | 1.2612 ± 0.1109 | 0.9558 ± 0.0928 | 1.9413 ± 0.2349 | 0.0578 ± 0.0084 | 64.0164 ± 1.3208 | 30.3321 ± 2.4242 |</w:t>
-      </w:r>
-    </w:p>
+    <w:tbl>
+      <w:tblPr>
+        <w:tblW w:type="auto" w:w="0"/>
+        <w:tblLook w:firstColumn="1" w:firstRow="1" w:lastColumn="0" w:lastRow="0" w:noHBand="0" w:noVBand="1" w:val="04A0"/>
+        <w:tblBorders>
+          <w:top w:val="single" w:sz="12" w:space="0" w:color="000000"/>
+          <w:bottom w:val="single" w:sz="12" w:space="0" w:color="000000"/>
+          <w:left w:val="nil"/>
+          <w:right w:val="nil"/>
+          <w:insideV w:val="nil"/>
+          <w:insideH w:val="nil"/>
+        </w:tblBorders>
+      </w:tblPr>
+      <w:tblGrid>
+        <w:gridCol w:w="1183"/>
+        <w:gridCol w:w="1183"/>
+        <w:gridCol w:w="1183"/>
+        <w:gridCol w:w="1183"/>
+        <w:gridCol w:w="1183"/>
+        <w:gridCol w:w="1183"/>
+        <w:gridCol w:w="1183"/>
+        <w:gridCol w:w="1183"/>
+      </w:tblGrid>
+      <w:tr>
+        <w:trPr/>
+        <w:tc>
+          <w:tcPr>
+            <w:tcW w:type="dxa" w:w="1183"/>
+            <w:tcBorders>
+              <w:bottom w:val="single" w:sz="6" w:color="000000"/>
+            </w:tcBorders>
+          </w:tcPr>
+          <w:p>
+            <w:pPr>
+              <w:jc w:val="center"/>
+            </w:pPr>
+            <w:r>
+              <w:rPr>
+                <w:rFonts w:ascii="Times New Roman" w:hAnsi="Times New Roman" w:eastAsia="Times New Roman"/>
+                <w:b/>
+                <w:color w:val="000000"/>
+                <w:sz w:val="22"/>
+              </w:rPr>
+              <w:t>Group</w:t>
+            </w:r>
+          </w:p>
+        </w:tc>
+        <w:tc>
+          <w:tcPr>
+            <w:tcW w:type="dxa" w:w="1183"/>
+            <w:tcBorders>
+              <w:bottom w:val="single" w:sz="6" w:color="000000"/>
+            </w:tcBorders>
+          </w:tcPr>
+          <w:p>
+            <w:pPr>
+              <w:jc w:val="center"/>
+            </w:pPr>
+            <w:r>
+              <w:rPr>
+                <w:rFonts w:ascii="Times New Roman" w:hAnsi="Times New Roman" w:eastAsia="Times New Roman"/>
+                <w:b/>
+                <w:color w:val="000000"/>
+                <w:sz w:val="22"/>
+              </w:rPr>
+              <w:t>Prot (g/dL)</w:t>
+            </w:r>
+          </w:p>
+        </w:tc>
+        <w:tc>
+          <w:tcPr>
+            <w:tcW w:type="dxa" w:w="1183"/>
+            <w:tcBorders>
+              <w:bottom w:val="single" w:sz="6" w:color="000000"/>
+            </w:tcBorders>
+          </w:tcPr>
+          <w:p>
+            <w:pPr>
+              <w:jc w:val="center"/>
+            </w:pPr>
+            <w:r>
+              <w:rPr>
+                <w:rFonts w:ascii="Times New Roman" w:hAnsi="Times New Roman" w:eastAsia="Times New Roman"/>
+                <w:b/>
+                <w:color w:val="000000"/>
+                <w:sz w:val="22"/>
+              </w:rPr>
+              <w:t>SOD (U/g Prot)</w:t>
+            </w:r>
+          </w:p>
+        </w:tc>
+        <w:tc>
+          <w:tcPr>
+            <w:tcW w:type="dxa" w:w="1183"/>
+            <w:tcBorders>
+              <w:bottom w:val="single" w:sz="6" w:color="000000"/>
+            </w:tcBorders>
+          </w:tcPr>
+          <w:p>
+            <w:pPr>
+              <w:jc w:val="center"/>
+            </w:pPr>
+            <w:r>
+              <w:rPr>
+                <w:rFonts w:ascii="Times New Roman" w:hAnsi="Times New Roman" w:eastAsia="Times New Roman"/>
+                <w:b/>
+                <w:color w:val="000000"/>
+                <w:sz w:val="22"/>
+              </w:rPr>
+              <w:t>CAT (U/g Prot)</w:t>
+            </w:r>
+          </w:p>
+        </w:tc>
+        <w:tc>
+          <w:tcPr>
+            <w:tcW w:type="dxa" w:w="1183"/>
+            <w:tcBorders>
+              <w:bottom w:val="single" w:sz="6" w:color="000000"/>
+            </w:tcBorders>
+          </w:tcPr>
+          <w:p>
+            <w:pPr>
+              <w:jc w:val="center"/>
+            </w:pPr>
+            <w:r>
+              <w:rPr>
+                <w:rFonts w:ascii="Times New Roman" w:hAnsi="Times New Roman" w:eastAsia="Times New Roman"/>
+                <w:b/>
+                <w:color w:val="000000"/>
+                <w:sz w:val="22"/>
+              </w:rPr>
+              <w:t>GPx (U/g Prot)</w:t>
+            </w:r>
+          </w:p>
+        </w:tc>
+        <w:tc>
+          <w:tcPr>
+            <w:tcW w:type="dxa" w:w="1183"/>
+            <w:tcBorders>
+              <w:bottom w:val="single" w:sz="6" w:color="000000"/>
+            </w:tcBorders>
+          </w:tcPr>
+          <w:p>
+            <w:pPr>
+              <w:jc w:val="center"/>
+            </w:pPr>
+            <w:r>
+              <w:rPr>
+                <w:rFonts w:ascii="Times New Roman" w:hAnsi="Times New Roman" w:eastAsia="Times New Roman"/>
+                <w:b/>
+                <w:color w:val="000000"/>
+                <w:sz w:val="22"/>
+              </w:rPr>
+              <w:t>MDA (mol/g Prot)</w:t>
+            </w:r>
+          </w:p>
+        </w:tc>
+        <w:tc>
+          <w:tcPr>
+            <w:tcW w:type="dxa" w:w="1183"/>
+            <w:tcBorders>
+              <w:bottom w:val="single" w:sz="6" w:color="000000"/>
+            </w:tcBorders>
+          </w:tcPr>
+          <w:p>
+            <w:pPr>
+              <w:jc w:val="center"/>
+            </w:pPr>
+            <w:r>
+              <w:rPr>
+                <w:rFonts w:ascii="Times New Roman" w:hAnsi="Times New Roman" w:eastAsia="Times New Roman"/>
+                <w:b/>
+                <w:color w:val="000000"/>
+                <w:sz w:val="22"/>
+              </w:rPr>
+              <w:t>Red. GSH (ug/mL)</w:t>
+            </w:r>
+          </w:p>
+        </w:tc>
+        <w:tc>
+          <w:tcPr>
+            <w:tcW w:type="dxa" w:w="1183"/>
+            <w:tcBorders>
+              <w:bottom w:val="single" w:sz="6" w:color="000000"/>
+            </w:tcBorders>
+          </w:tcPr>
+          <w:p>
+            <w:pPr>
+              <w:jc w:val="center"/>
+            </w:pPr>
+            <w:r>
+              <w:rPr>
+                <w:rFonts w:ascii="Times New Roman" w:hAnsi="Times New Roman" w:eastAsia="Times New Roman"/>
+                <w:b/>
+                <w:color w:val="000000"/>
+                <w:sz w:val="22"/>
+              </w:rPr>
+              <w:t>TAC (ug/mL)</w:t>
+            </w:r>
+          </w:p>
+        </w:tc>
+      </w:tr>
+      <w:tr>
+        <w:tc>
+          <w:tcPr>
+            <w:tcW w:type="dxa" w:w="1183"/>
+          </w:tcPr>
+          <w:p>
+            <w:pPr>
+              <w:jc w:val="center"/>
+            </w:pPr>
+            <w:r>
+              <w:rPr>
+                <w:rFonts w:ascii="Times New Roman" w:hAnsi="Times New Roman" w:eastAsia="Times New Roman"/>
+                <w:b/>
+                <w:color w:val="000000"/>
+                <w:sz w:val="22"/>
+              </w:rPr>
+              <w:t>NC</w:t>
+            </w:r>
+          </w:p>
+        </w:tc>
+        <w:tc>
+          <w:tcPr>
+            <w:tcW w:type="dxa" w:w="1183"/>
+          </w:tcPr>
+          <w:p>
+            <w:pPr>
+              <w:jc w:val="center"/>
+            </w:pPr>
+            <w:r>
+              <w:rPr>
+                <w:rFonts w:ascii="Times New Roman" w:hAnsi="Times New Roman" w:eastAsia="Times New Roman"/>
+                <w:color w:val="000000"/>
+                <w:sz w:val="22"/>
+              </w:rPr>
+              <w:t>0.6356 ± 0.0154</w:t>
+            </w:r>
+          </w:p>
+        </w:tc>
+        <w:tc>
+          <w:tcPr>
+            <w:tcW w:type="dxa" w:w="1183"/>
+          </w:tcPr>
+          <w:p>
+            <w:pPr>
+              <w:jc w:val="center"/>
+            </w:pPr>
+            <w:r>
+              <w:rPr>
+                <w:rFonts w:ascii="Times New Roman" w:hAnsi="Times New Roman" w:eastAsia="Times New Roman"/>
+                <w:color w:val="000000"/>
+                <w:sz w:val="22"/>
+              </w:rPr>
+              <w:t>1.6934 ± 0.0938</w:t>
+            </w:r>
+          </w:p>
+        </w:tc>
+        <w:tc>
+          <w:tcPr>
+            <w:tcW w:type="dxa" w:w="1183"/>
+          </w:tcPr>
+          <w:p>
+            <w:pPr>
+              <w:jc w:val="center"/>
+            </w:pPr>
+            <w:r>
+              <w:rPr>
+                <w:rFonts w:ascii="Times New Roman" w:hAnsi="Times New Roman" w:eastAsia="Times New Roman"/>
+                <w:color w:val="000000"/>
+                <w:sz w:val="22"/>
+              </w:rPr>
+              <w:t>1.2774 ± 0.0437</w:t>
+            </w:r>
+          </w:p>
+        </w:tc>
+        <w:tc>
+          <w:tcPr>
+            <w:tcW w:type="dxa" w:w="1183"/>
+          </w:tcPr>
+          <w:p>
+            <w:pPr>
+              <w:jc w:val="center"/>
+            </w:pPr>
+            <w:r>
+              <w:rPr>
+                <w:rFonts w:ascii="Times New Roman" w:hAnsi="Times New Roman" w:eastAsia="Times New Roman"/>
+                <w:color w:val="000000"/>
+                <w:sz w:val="22"/>
+              </w:rPr>
+              <w:t>2.5788 ± 0.2428</w:t>
+            </w:r>
+          </w:p>
+        </w:tc>
+        <w:tc>
+          <w:tcPr>
+            <w:tcW w:type="dxa" w:w="1183"/>
+          </w:tcPr>
+          <w:p>
+            <w:pPr>
+              <w:jc w:val="center"/>
+            </w:pPr>
+            <w:r>
+              <w:rPr>
+                <w:rFonts w:ascii="Times New Roman" w:hAnsi="Times New Roman" w:eastAsia="Times New Roman"/>
+                <w:color w:val="000000"/>
+                <w:sz w:val="22"/>
+              </w:rPr>
+              <w:t>0.2991 ± 0.0584</w:t>
+            </w:r>
+          </w:p>
+        </w:tc>
+        <w:tc>
+          <w:tcPr>
+            <w:tcW w:type="dxa" w:w="1183"/>
+          </w:tcPr>
+          <w:p>
+            <w:pPr>
+              <w:jc w:val="center"/>
+            </w:pPr>
+            <w:r>
+              <w:rPr>
+                <w:rFonts w:ascii="Times New Roman" w:hAnsi="Times New Roman" w:eastAsia="Times New Roman"/>
+                <w:color w:val="000000"/>
+                <w:sz w:val="22"/>
+              </w:rPr>
+              <w:t>70.0984 ± 0.6081</w:t>
+            </w:r>
+          </w:p>
+        </w:tc>
+        <w:tc>
+          <w:tcPr>
+            <w:tcW w:type="dxa" w:w="1183"/>
+          </w:tcPr>
+          <w:p>
+            <w:pPr>
+              <w:jc w:val="center"/>
+            </w:pPr>
+            <w:r>
+              <w:rPr>
+                <w:rFonts w:ascii="Times New Roman" w:hAnsi="Times New Roman" w:eastAsia="Times New Roman"/>
+                <w:color w:val="000000"/>
+                <w:sz w:val="22"/>
+              </w:rPr>
+              <w:t>30.3469 ± 2.7154</w:t>
+            </w:r>
+          </w:p>
+        </w:tc>
+      </w:tr>
+      <w:tr>
+        <w:tc>
+          <w:tcPr>
+            <w:tcW w:type="dxa" w:w="1183"/>
+          </w:tcPr>
+          <w:p>
+            <w:pPr>
+              <w:jc w:val="center"/>
+            </w:pPr>
+            <w:r>
+              <w:rPr>
+                <w:rFonts w:ascii="Times New Roman" w:hAnsi="Times New Roman" w:eastAsia="Times New Roman"/>
+                <w:b/>
+                <w:color w:val="000000"/>
+                <w:sz w:val="22"/>
+              </w:rPr>
+              <w:t>MC</w:t>
+            </w:r>
+          </w:p>
+        </w:tc>
+        <w:tc>
+          <w:tcPr>
+            <w:tcW w:type="dxa" w:w="1183"/>
+          </w:tcPr>
+          <w:p>
+            <w:pPr>
+              <w:jc w:val="center"/>
+            </w:pPr>
+            <w:r>
+              <w:rPr>
+                <w:rFonts w:ascii="Times New Roman" w:hAnsi="Times New Roman" w:eastAsia="Times New Roman"/>
+                <w:color w:val="000000"/>
+                <w:sz w:val="22"/>
+              </w:rPr>
+              <w:t>0.7780 ± 0.0335</w:t>
+            </w:r>
+          </w:p>
+        </w:tc>
+        <w:tc>
+          <w:tcPr>
+            <w:tcW w:type="dxa" w:w="1183"/>
+          </w:tcPr>
+          <w:p>
+            <w:pPr>
+              <w:jc w:val="center"/>
+            </w:pPr>
+            <w:r>
+              <w:rPr>
+                <w:rFonts w:ascii="Times New Roman" w:hAnsi="Times New Roman" w:eastAsia="Times New Roman"/>
+                <w:color w:val="000000"/>
+                <w:sz w:val="22"/>
+              </w:rPr>
+              <w:t>1.3108 ± 0.0594</w:t>
+            </w:r>
+          </w:p>
+        </w:tc>
+        <w:tc>
+          <w:tcPr>
+            <w:tcW w:type="dxa" w:w="1183"/>
+          </w:tcPr>
+          <w:p>
+            <w:pPr>
+              <w:jc w:val="center"/>
+            </w:pPr>
+            <w:r>
+              <w:rPr>
+                <w:rFonts w:ascii="Times New Roman" w:hAnsi="Times New Roman" w:eastAsia="Times New Roman"/>
+                <w:color w:val="000000"/>
+                <w:sz w:val="22"/>
+              </w:rPr>
+              <w:t>0.9805 ± 0.0360</w:t>
+            </w:r>
+          </w:p>
+        </w:tc>
+        <w:tc>
+          <w:tcPr>
+            <w:tcW w:type="dxa" w:w="1183"/>
+          </w:tcPr>
+          <w:p>
+            <w:pPr>
+              <w:jc w:val="center"/>
+            </w:pPr>
+            <w:r>
+              <w:rPr>
+                <w:rFonts w:ascii="Times New Roman" w:hAnsi="Times New Roman" w:eastAsia="Times New Roman"/>
+                <w:color w:val="000000"/>
+                <w:sz w:val="22"/>
+              </w:rPr>
+              <w:t>2.1189 ± 0.2278</w:t>
+            </w:r>
+          </w:p>
+        </w:tc>
+        <w:tc>
+          <w:tcPr>
+            <w:tcW w:type="dxa" w:w="1183"/>
+          </w:tcPr>
+          <w:p>
+            <w:pPr>
+              <w:jc w:val="center"/>
+            </w:pPr>
+            <w:r>
+              <w:rPr>
+                <w:rFonts w:ascii="Times New Roman" w:hAnsi="Times New Roman" w:eastAsia="Times New Roman"/>
+                <w:color w:val="000000"/>
+                <w:sz w:val="22"/>
+              </w:rPr>
+              <w:t>0.1370 ± 0.0211</w:t>
+            </w:r>
+          </w:p>
+        </w:tc>
+        <w:tc>
+          <w:tcPr>
+            <w:tcW w:type="dxa" w:w="1183"/>
+          </w:tcPr>
+          <w:p>
+            <w:pPr>
+              <w:jc w:val="center"/>
+            </w:pPr>
+            <w:r>
+              <w:rPr>
+                <w:rFonts w:ascii="Times New Roman" w:hAnsi="Times New Roman" w:eastAsia="Times New Roman"/>
+                <w:color w:val="000000"/>
+                <w:sz w:val="22"/>
+              </w:rPr>
+              <w:t>69.6393 ± 2.0439</w:t>
+            </w:r>
+          </w:p>
+        </w:tc>
+        <w:tc>
+          <w:tcPr>
+            <w:tcW w:type="dxa" w:w="1183"/>
+          </w:tcPr>
+          <w:p>
+            <w:pPr>
+              <w:jc w:val="center"/>
+            </w:pPr>
+            <w:r>
+              <w:rPr>
+                <w:rFonts w:ascii="Times New Roman" w:hAnsi="Times New Roman" w:eastAsia="Times New Roman"/>
+                <w:color w:val="000000"/>
+                <w:sz w:val="22"/>
+              </w:rPr>
+              <w:t>38.1845 ± 2.9430</w:t>
+            </w:r>
+          </w:p>
+        </w:tc>
+      </w:tr>
+      <w:tr>
+        <w:tc>
+          <w:tcPr>
+            <w:tcW w:type="dxa" w:w="1183"/>
+          </w:tcPr>
+          <w:p>
+            <w:pPr>
+              <w:jc w:val="center"/>
+            </w:pPr>
+            <w:r>
+              <w:rPr>
+                <w:rFonts w:ascii="Times New Roman" w:hAnsi="Times New Roman" w:eastAsia="Times New Roman"/>
+                <w:b/>
+                <w:color w:val="000000"/>
+                <w:sz w:val="22"/>
+              </w:rPr>
+              <w:t>CL</w:t>
+            </w:r>
+          </w:p>
+        </w:tc>
+        <w:tc>
+          <w:tcPr>
+            <w:tcW w:type="dxa" w:w="1183"/>
+          </w:tcPr>
+          <w:p>
+            <w:pPr>
+              <w:jc w:val="center"/>
+            </w:pPr>
+            <w:r>
+              <w:rPr>
+                <w:rFonts w:ascii="Times New Roman" w:hAnsi="Times New Roman" w:eastAsia="Times New Roman"/>
+                <w:color w:val="000000"/>
+                <w:sz w:val="22"/>
+              </w:rPr>
+              <w:t>0.9114 ± 0.0576</w:t>
+            </w:r>
+          </w:p>
+        </w:tc>
+        <w:tc>
+          <w:tcPr>
+            <w:tcW w:type="dxa" w:w="1183"/>
+          </w:tcPr>
+          <w:p>
+            <w:pPr>
+              <w:jc w:val="center"/>
+            </w:pPr>
+            <w:r>
+              <w:rPr>
+                <w:rFonts w:ascii="Times New Roman" w:hAnsi="Times New Roman" w:eastAsia="Times New Roman"/>
+                <w:color w:val="000000"/>
+                <w:sz w:val="22"/>
+              </w:rPr>
+              <w:t>1.1535 ± 0.0764</w:t>
+            </w:r>
+          </w:p>
+        </w:tc>
+        <w:tc>
+          <w:tcPr>
+            <w:tcW w:type="dxa" w:w="1183"/>
+          </w:tcPr>
+          <w:p>
+            <w:pPr>
+              <w:jc w:val="center"/>
+            </w:pPr>
+            <w:r>
+              <w:rPr>
+                <w:rFonts w:ascii="Times New Roman" w:hAnsi="Times New Roman" w:eastAsia="Times New Roman"/>
+                <w:color w:val="000000"/>
+                <w:sz w:val="22"/>
+              </w:rPr>
+              <w:t>0.8102 ± 0.0535</w:t>
+            </w:r>
+          </w:p>
+        </w:tc>
+        <w:tc>
+          <w:tcPr>
+            <w:tcW w:type="dxa" w:w="1183"/>
+          </w:tcPr>
+          <w:p>
+            <w:pPr>
+              <w:jc w:val="center"/>
+            </w:pPr>
+            <w:r>
+              <w:rPr>
+                <w:rFonts w:ascii="Times New Roman" w:hAnsi="Times New Roman" w:eastAsia="Times New Roman"/>
+                <w:color w:val="000000"/>
+                <w:sz w:val="22"/>
+              </w:rPr>
+              <w:t>1.5567 ± 0.0970</w:t>
+            </w:r>
+          </w:p>
+        </w:tc>
+        <w:tc>
+          <w:tcPr>
+            <w:tcW w:type="dxa" w:w="1183"/>
+          </w:tcPr>
+          <w:p>
+            <w:pPr>
+              <w:jc w:val="center"/>
+            </w:pPr>
+            <w:r>
+              <w:rPr>
+                <w:rFonts w:ascii="Times New Roman" w:hAnsi="Times New Roman" w:eastAsia="Times New Roman"/>
+                <w:color w:val="000000"/>
+                <w:sz w:val="22"/>
+              </w:rPr>
+              <w:t>0.4470 ± 0.0953</w:t>
+            </w:r>
+          </w:p>
+        </w:tc>
+        <w:tc>
+          <w:tcPr>
+            <w:tcW w:type="dxa" w:w="1183"/>
+          </w:tcPr>
+          <w:p>
+            <w:pPr>
+              <w:jc w:val="center"/>
+            </w:pPr>
+            <w:r>
+              <w:rPr>
+                <w:rFonts w:ascii="Times New Roman" w:hAnsi="Times New Roman" w:eastAsia="Times New Roman"/>
+                <w:color w:val="000000"/>
+                <w:sz w:val="22"/>
+              </w:rPr>
+              <w:t>68.1196 ± 1.1053</w:t>
+            </w:r>
+          </w:p>
+        </w:tc>
+        <w:tc>
+          <w:tcPr>
+            <w:tcW w:type="dxa" w:w="1183"/>
+          </w:tcPr>
+          <w:p>
+            <w:pPr>
+              <w:jc w:val="center"/>
+            </w:pPr>
+            <w:r>
+              <w:rPr>
+                <w:rFonts w:ascii="Times New Roman" w:hAnsi="Times New Roman" w:eastAsia="Times New Roman"/>
+                <w:color w:val="000000"/>
+                <w:sz w:val="22"/>
+              </w:rPr>
+              <w:t>37.4126 ± 2.5205</w:t>
+            </w:r>
+          </w:p>
+        </w:tc>
+      </w:tr>
+      <w:tr>
+        <w:tc>
+          <w:tcPr>
+            <w:tcW w:type="dxa" w:w="1183"/>
+          </w:tcPr>
+          <w:p>
+            <w:pPr>
+              <w:jc w:val="center"/>
+            </w:pPr>
+            <w:r>
+              <w:rPr>
+                <w:rFonts w:ascii="Times New Roman" w:hAnsi="Times New Roman" w:eastAsia="Times New Roman"/>
+                <w:b/>
+                <w:color w:val="000000"/>
+                <w:sz w:val="22"/>
+              </w:rPr>
+              <w:t>IB</w:t>
+            </w:r>
+          </w:p>
+        </w:tc>
+        <w:tc>
+          <w:tcPr>
+            <w:tcW w:type="dxa" w:w="1183"/>
+          </w:tcPr>
+          <w:p>
+            <w:pPr>
+              <w:jc w:val="center"/>
+            </w:pPr>
+            <w:r>
+              <w:rPr>
+                <w:rFonts w:ascii="Times New Roman" w:hAnsi="Times New Roman" w:eastAsia="Times New Roman"/>
+                <w:color w:val="000000"/>
+                <w:sz w:val="22"/>
+              </w:rPr>
+              <w:t>0.8938 ± 0.1002</w:t>
+            </w:r>
+          </w:p>
+        </w:tc>
+        <w:tc>
+          <w:tcPr>
+            <w:tcW w:type="dxa" w:w="1183"/>
+          </w:tcPr>
+          <w:p>
+            <w:pPr>
+              <w:jc w:val="center"/>
+            </w:pPr>
+            <w:r>
+              <w:rPr>
+                <w:rFonts w:ascii="Times New Roman" w:hAnsi="Times New Roman" w:eastAsia="Times New Roman"/>
+                <w:color w:val="000000"/>
+                <w:sz w:val="22"/>
+              </w:rPr>
+              <w:t>1.2612 ± 0.1109</w:t>
+            </w:r>
+          </w:p>
+        </w:tc>
+        <w:tc>
+          <w:tcPr>
+            <w:tcW w:type="dxa" w:w="1183"/>
+          </w:tcPr>
+          <w:p>
+            <w:pPr>
+              <w:jc w:val="center"/>
+            </w:pPr>
+            <w:r>
+              <w:rPr>
+                <w:rFonts w:ascii="Times New Roman" w:hAnsi="Times New Roman" w:eastAsia="Times New Roman"/>
+                <w:color w:val="000000"/>
+                <w:sz w:val="22"/>
+              </w:rPr>
+              <w:t>0.9558 ± 0.0928</w:t>
+            </w:r>
+          </w:p>
+        </w:tc>
+        <w:tc>
+          <w:tcPr>
+            <w:tcW w:type="dxa" w:w="1183"/>
+          </w:tcPr>
+          <w:p>
+            <w:pPr>
+              <w:jc w:val="center"/>
+            </w:pPr>
+            <w:r>
+              <w:rPr>
+                <w:rFonts w:ascii="Times New Roman" w:hAnsi="Times New Roman" w:eastAsia="Times New Roman"/>
+                <w:color w:val="000000"/>
+                <w:sz w:val="22"/>
+              </w:rPr>
+              <w:t>1.9413 ± 0.2349</w:t>
+            </w:r>
+          </w:p>
+        </w:tc>
+        <w:tc>
+          <w:tcPr>
+            <w:tcW w:type="dxa" w:w="1183"/>
+          </w:tcPr>
+          <w:p>
+            <w:pPr>
+              <w:jc w:val="center"/>
+            </w:pPr>
+            <w:r>
+              <w:rPr>
+                <w:rFonts w:ascii="Times New Roman" w:hAnsi="Times New Roman" w:eastAsia="Times New Roman"/>
+                <w:color w:val="000000"/>
+                <w:sz w:val="22"/>
+              </w:rPr>
+              <w:t>0.0578 ± 0.0084</w:t>
+            </w:r>
+          </w:p>
+        </w:tc>
+        <w:tc>
+          <w:tcPr>
+            <w:tcW w:type="dxa" w:w="1183"/>
+          </w:tcPr>
+          <w:p>
+            <w:pPr>
+              <w:jc w:val="center"/>
+            </w:pPr>
+            <w:r>
+              <w:rPr>
+                <w:rFonts w:ascii="Times New Roman" w:hAnsi="Times New Roman" w:eastAsia="Times New Roman"/>
+                <w:color w:val="000000"/>
+                <w:sz w:val="22"/>
+              </w:rPr>
+              <w:t>64.0164 ± 1.3208</w:t>
+            </w:r>
+          </w:p>
+        </w:tc>
+        <w:tc>
+          <w:tcPr>
+            <w:tcW w:type="dxa" w:w="1183"/>
+          </w:tcPr>
+          <w:p>
+            <w:pPr>
+              <w:jc w:val="center"/>
+            </w:pPr>
+            <w:r>
+              <w:rPr>
+                <w:rFonts w:ascii="Times New Roman" w:hAnsi="Times New Roman" w:eastAsia="Times New Roman"/>
+                <w:color w:val="000000"/>
+                <w:sz w:val="22"/>
+              </w:rPr>
+              <w:t>30.3321 ± 2.4242</w:t>
+            </w:r>
+          </w:p>
+        </w:tc>
+      </w:tr>
+    </w:tbl>
     <w:p>
       <w:pPr>
         <w:spacing w:line="360" w:lineRule="auto" w:after="0"/>
@@ -238,189 +877,944 @@
         <w:t>Table 3.2: Group Means and Standard Errors (Bay Leaf Run)</w:t>
       </w:r>
     </w:p>
-    <w:p>
-      <w:pPr>
-        <w:spacing w:line="360" w:lineRule="auto" w:after="0"/>
-        <w:jc w:val="both"/>
-      </w:pPr>
-      <w:r>
-        <w:rPr>
-          <w:rFonts w:ascii="Times New Roman" w:hAnsi="Times New Roman" w:eastAsia="Times New Roman"/>
-          <w:color w:val="000000"/>
-          <w:sz w:val="24"/>
-        </w:rPr>
-        <w:t>| Group | Prot (g/dL) | SOD (U/g Prot) | CAT (U/g Prot) | GPx (U/g Prot) | MDA (mol/g Prot) | Red. GSH (ug/mL) | TAC (ug/mL) |</w:t>
-      </w:r>
-    </w:p>
-    <w:p>
-      <w:pPr>
-        <w:spacing w:line="360" w:lineRule="auto" w:after="0"/>
-        <w:jc w:val="both"/>
-      </w:pPr>
-      <w:r>
-        <w:rPr>
-          <w:rFonts w:ascii="Times New Roman" w:hAnsi="Times New Roman" w:eastAsia="Times New Roman"/>
-          <w:color w:val="000000"/>
-          <w:sz w:val="24"/>
-        </w:rPr>
-        <w:t>| :--- | :---: | :---: | :---: | :---: | :---: | :---: | :---: |</w:t>
-      </w:r>
-    </w:p>
-    <w:p>
-      <w:pPr>
-        <w:spacing w:line="360" w:lineRule="auto" w:after="0"/>
-        <w:jc w:val="both"/>
-      </w:pPr>
-      <w:r>
-        <w:rPr>
-          <w:rFonts w:ascii="Times New Roman" w:hAnsi="Times New Roman" w:eastAsia="Times New Roman"/>
-          <w:color w:val="000000"/>
-          <w:sz w:val="24"/>
-        </w:rPr>
-        <w:t xml:space="preserve">| </w:t>
-      </w:r>
-      <w:r>
-        <w:rPr>
-          <w:rFonts w:ascii="Times New Roman" w:hAnsi="Times New Roman" w:eastAsia="Times New Roman"/>
-          <w:b/>
-          <w:color w:val="000000"/>
-          <w:sz w:val="24"/>
-        </w:rPr>
-        <w:t>NG</w:t>
-      </w:r>
-      <w:r>
-        <w:rPr>
-          <w:rFonts w:ascii="Times New Roman" w:hAnsi="Times New Roman" w:eastAsia="Times New Roman"/>
-          <w:color w:val="000000"/>
-          <w:sz w:val="24"/>
-        </w:rPr>
-        <w:t xml:space="preserve"> | 1.4842 ± 0.2724 | 1.3069 ± 0.2573 | 0.3285 ± 0.0443 | 1.2797 ± 0.1573 | 0.1893 ± 0.0693 | 68.8525 ± 0.6825 | 18.7946 ± 1.9104 |</w:t>
-      </w:r>
-    </w:p>
-    <w:p>
-      <w:pPr>
-        <w:spacing w:line="360" w:lineRule="auto" w:after="0"/>
-        <w:jc w:val="both"/>
-      </w:pPr>
-      <w:r>
-        <w:rPr>
-          <w:rFonts w:ascii="Times New Roman" w:hAnsi="Times New Roman" w:eastAsia="Times New Roman"/>
-          <w:color w:val="000000"/>
-          <w:sz w:val="24"/>
-        </w:rPr>
-        <w:t xml:space="preserve">| </w:t>
-      </w:r>
-      <w:r>
-        <w:rPr>
-          <w:rFonts w:ascii="Times New Roman" w:hAnsi="Times New Roman" w:eastAsia="Times New Roman"/>
-          <w:b/>
-          <w:color w:val="000000"/>
-          <w:sz w:val="24"/>
-        </w:rPr>
-        <w:t>MG</w:t>
-      </w:r>
-      <w:r>
-        <w:rPr>
-          <w:rFonts w:ascii="Times New Roman" w:hAnsi="Times New Roman" w:eastAsia="Times New Roman"/>
-          <w:color w:val="000000"/>
-          <w:sz w:val="24"/>
-        </w:rPr>
-        <w:t xml:space="preserve"> | 1.3959 ± 0.2359 | 1.4010 ± 0.2637 | 0.4533 ± 0.0414 | 1.1560 ± 0.0620 | 0.1947 ± 0.0199 | 69.9454 ± 0.5783 | 17.0972 ± 0.6768 |</w:t>
-      </w:r>
-    </w:p>
-    <w:p>
-      <w:pPr>
-        <w:spacing w:line="360" w:lineRule="auto" w:after="0"/>
-        <w:jc w:val="both"/>
-      </w:pPr>
-      <w:r>
-        <w:rPr>
-          <w:rFonts w:ascii="Times New Roman" w:hAnsi="Times New Roman" w:eastAsia="Times New Roman"/>
-          <w:color w:val="000000"/>
-          <w:sz w:val="24"/>
-        </w:rPr>
-        <w:t xml:space="preserve">| </w:t>
-      </w:r>
-      <w:r>
-        <w:rPr>
-          <w:rFonts w:ascii="Times New Roman" w:hAnsi="Times New Roman" w:eastAsia="Times New Roman"/>
-          <w:b/>
-          <w:color w:val="000000"/>
-          <w:sz w:val="24"/>
-        </w:rPr>
-        <w:t>BL</w:t>
-      </w:r>
-      <w:r>
-        <w:rPr>
-          <w:rFonts w:ascii="Times New Roman" w:hAnsi="Times New Roman" w:eastAsia="Times New Roman"/>
-          <w:color w:val="000000"/>
-          <w:sz w:val="24"/>
-        </w:rPr>
-        <w:t xml:space="preserve"> | 1.1510 ± 0.0737 | 1.5926 ± 0.0894 | 0.5541 ± 0.0509 | 1.6304 ± 0.1136 | 0.2652 ± 0.0208 | 68.4809 ± 2.5697 | 17.8401 ± 1.1793 |</w:t>
-      </w:r>
-    </w:p>
-    <w:p>
-      <w:pPr>
-        <w:spacing w:line="360" w:lineRule="auto" w:after="0"/>
-        <w:jc w:val="both"/>
-      </w:pPr>
-      <w:r>
-        <w:rPr>
-          <w:rFonts w:ascii="Times New Roman" w:hAnsi="Times New Roman" w:eastAsia="Times New Roman"/>
-          <w:color w:val="000000"/>
-          <w:sz w:val="24"/>
-        </w:rPr>
-        <w:t xml:space="preserve">| </w:t>
-      </w:r>
-      <w:r>
-        <w:rPr>
-          <w:rFonts w:ascii="Times New Roman" w:hAnsi="Times New Roman" w:eastAsia="Times New Roman"/>
-          <w:b/>
-          <w:color w:val="000000"/>
-          <w:sz w:val="24"/>
-        </w:rPr>
-        <w:t>IBU</w:t>
-      </w:r>
-      <w:r>
-        <w:rPr>
-          <w:rFonts w:ascii="Times New Roman" w:hAnsi="Times New Roman" w:eastAsia="Times New Roman"/>
-          <w:color w:val="000000"/>
-          <w:sz w:val="24"/>
-        </w:rPr>
-        <w:t xml:space="preserve"> | 1.2966 ± 0.1628 | 1.4709 ± 0.1637 | 0.6145 ± 0.1466 | 1.6081 ± 0.2754 | 0.2377 ± 0.0524 | 70.0546 ± 0.6085 | 16.6544 ± 0.7918 |</w:t>
-      </w:r>
-    </w:p>
-    <w:p>
-      <w:pPr>
-        <w:spacing w:line="360" w:lineRule="auto" w:after="0"/>
-        <w:jc w:val="both"/>
-      </w:pPr>
-      <w:r>
-        <w:rPr>
-          <w:rFonts w:ascii="Times New Roman" w:hAnsi="Times New Roman" w:eastAsia="Times New Roman"/>
-          <w:color w:val="000000"/>
-          <w:sz w:val="24"/>
-        </w:rPr>
-        <w:t xml:space="preserve">| </w:t>
-      </w:r>
-      <w:r>
-        <w:rPr>
-          <w:rFonts w:ascii="Times New Roman" w:hAnsi="Times New Roman" w:eastAsia="Times New Roman"/>
-          <w:b/>
-          <w:color w:val="000000"/>
-          <w:sz w:val="24"/>
-        </w:rPr>
-        <w:t>CL</w:t>
-      </w:r>
-      <w:r>
-        <w:rPr>
-          <w:rFonts w:ascii="Times New Roman" w:hAnsi="Times New Roman" w:eastAsia="Times New Roman"/>
-          <w:color w:val="000000"/>
-          <w:sz w:val="24"/>
-        </w:rPr>
-        <w:t xml:space="preserve"> | 1.1504 ± 0.2566 | 1.6703 ± 0.3716 | 0.5725 ± 0.0648 | 1.7265 ± 0.3234 | 0.2082 ± 0.0565 | 69.1803 ± 0.9836 | 20.4797 ± 5.2768 |</w:t>
-      </w:r>
-    </w:p>
+    <w:tbl>
+      <w:tblPr>
+        <w:tblW w:type="auto" w:w="0"/>
+        <w:tblLook w:firstColumn="1" w:firstRow="1" w:lastColumn="0" w:lastRow="0" w:noHBand="0" w:noVBand="1" w:val="04A0"/>
+        <w:tblBorders>
+          <w:top w:val="single" w:sz="12" w:space="0" w:color="000000"/>
+          <w:bottom w:val="single" w:sz="12" w:space="0" w:color="000000"/>
+          <w:left w:val="nil"/>
+          <w:right w:val="nil"/>
+          <w:insideV w:val="nil"/>
+          <w:insideH w:val="nil"/>
+        </w:tblBorders>
+      </w:tblPr>
+      <w:tblGrid>
+        <w:gridCol w:w="1183"/>
+        <w:gridCol w:w="1183"/>
+        <w:gridCol w:w="1183"/>
+        <w:gridCol w:w="1183"/>
+        <w:gridCol w:w="1183"/>
+        <w:gridCol w:w="1183"/>
+        <w:gridCol w:w="1183"/>
+        <w:gridCol w:w="1183"/>
+      </w:tblGrid>
+      <w:tr>
+        <w:trPr/>
+        <w:tc>
+          <w:tcPr>
+            <w:tcW w:type="dxa" w:w="1183"/>
+            <w:tcBorders>
+              <w:bottom w:val="single" w:sz="6" w:color="000000"/>
+            </w:tcBorders>
+          </w:tcPr>
+          <w:p>
+            <w:pPr>
+              <w:jc w:val="center"/>
+            </w:pPr>
+            <w:r>
+              <w:rPr>
+                <w:rFonts w:ascii="Times New Roman" w:hAnsi="Times New Roman" w:eastAsia="Times New Roman"/>
+                <w:b/>
+                <w:color w:val="000000"/>
+                <w:sz w:val="22"/>
+              </w:rPr>
+              <w:t>Group</w:t>
+            </w:r>
+          </w:p>
+        </w:tc>
+        <w:tc>
+          <w:tcPr>
+            <w:tcW w:type="dxa" w:w="1183"/>
+            <w:tcBorders>
+              <w:bottom w:val="single" w:sz="6" w:color="000000"/>
+            </w:tcBorders>
+          </w:tcPr>
+          <w:p>
+            <w:pPr>
+              <w:jc w:val="center"/>
+            </w:pPr>
+            <w:r>
+              <w:rPr>
+                <w:rFonts w:ascii="Times New Roman" w:hAnsi="Times New Roman" w:eastAsia="Times New Roman"/>
+                <w:b/>
+                <w:color w:val="000000"/>
+                <w:sz w:val="22"/>
+              </w:rPr>
+              <w:t>Prot (g/dL)</w:t>
+            </w:r>
+          </w:p>
+        </w:tc>
+        <w:tc>
+          <w:tcPr>
+            <w:tcW w:type="dxa" w:w="1183"/>
+            <w:tcBorders>
+              <w:bottom w:val="single" w:sz="6" w:color="000000"/>
+            </w:tcBorders>
+          </w:tcPr>
+          <w:p>
+            <w:pPr>
+              <w:jc w:val="center"/>
+            </w:pPr>
+            <w:r>
+              <w:rPr>
+                <w:rFonts w:ascii="Times New Roman" w:hAnsi="Times New Roman" w:eastAsia="Times New Roman"/>
+                <w:b/>
+                <w:color w:val="000000"/>
+                <w:sz w:val="22"/>
+              </w:rPr>
+              <w:t>SOD (U/g Prot)</w:t>
+            </w:r>
+          </w:p>
+        </w:tc>
+        <w:tc>
+          <w:tcPr>
+            <w:tcW w:type="dxa" w:w="1183"/>
+            <w:tcBorders>
+              <w:bottom w:val="single" w:sz="6" w:color="000000"/>
+            </w:tcBorders>
+          </w:tcPr>
+          <w:p>
+            <w:pPr>
+              <w:jc w:val="center"/>
+            </w:pPr>
+            <w:r>
+              <w:rPr>
+                <w:rFonts w:ascii="Times New Roman" w:hAnsi="Times New Roman" w:eastAsia="Times New Roman"/>
+                <w:b/>
+                <w:color w:val="000000"/>
+                <w:sz w:val="22"/>
+              </w:rPr>
+              <w:t>CAT (U/g Prot)</w:t>
+            </w:r>
+          </w:p>
+        </w:tc>
+        <w:tc>
+          <w:tcPr>
+            <w:tcW w:type="dxa" w:w="1183"/>
+            <w:tcBorders>
+              <w:bottom w:val="single" w:sz="6" w:color="000000"/>
+            </w:tcBorders>
+          </w:tcPr>
+          <w:p>
+            <w:pPr>
+              <w:jc w:val="center"/>
+            </w:pPr>
+            <w:r>
+              <w:rPr>
+                <w:rFonts w:ascii="Times New Roman" w:hAnsi="Times New Roman" w:eastAsia="Times New Roman"/>
+                <w:b/>
+                <w:color w:val="000000"/>
+                <w:sz w:val="22"/>
+              </w:rPr>
+              <w:t>GPx (U/g Prot)</w:t>
+            </w:r>
+          </w:p>
+        </w:tc>
+        <w:tc>
+          <w:tcPr>
+            <w:tcW w:type="dxa" w:w="1183"/>
+            <w:tcBorders>
+              <w:bottom w:val="single" w:sz="6" w:color="000000"/>
+            </w:tcBorders>
+          </w:tcPr>
+          <w:p>
+            <w:pPr>
+              <w:jc w:val="center"/>
+            </w:pPr>
+            <w:r>
+              <w:rPr>
+                <w:rFonts w:ascii="Times New Roman" w:hAnsi="Times New Roman" w:eastAsia="Times New Roman"/>
+                <w:b/>
+                <w:color w:val="000000"/>
+                <w:sz w:val="22"/>
+              </w:rPr>
+              <w:t>MDA (mol/g Prot)</w:t>
+            </w:r>
+          </w:p>
+        </w:tc>
+        <w:tc>
+          <w:tcPr>
+            <w:tcW w:type="dxa" w:w="1183"/>
+            <w:tcBorders>
+              <w:bottom w:val="single" w:sz="6" w:color="000000"/>
+            </w:tcBorders>
+          </w:tcPr>
+          <w:p>
+            <w:pPr>
+              <w:jc w:val="center"/>
+            </w:pPr>
+            <w:r>
+              <w:rPr>
+                <w:rFonts w:ascii="Times New Roman" w:hAnsi="Times New Roman" w:eastAsia="Times New Roman"/>
+                <w:b/>
+                <w:color w:val="000000"/>
+                <w:sz w:val="22"/>
+              </w:rPr>
+              <w:t>Red. GSH (ug/mL)</w:t>
+            </w:r>
+          </w:p>
+        </w:tc>
+        <w:tc>
+          <w:tcPr>
+            <w:tcW w:type="dxa" w:w="1183"/>
+            <w:tcBorders>
+              <w:bottom w:val="single" w:sz="6" w:color="000000"/>
+            </w:tcBorders>
+          </w:tcPr>
+          <w:p>
+            <w:pPr>
+              <w:jc w:val="center"/>
+            </w:pPr>
+            <w:r>
+              <w:rPr>
+                <w:rFonts w:ascii="Times New Roman" w:hAnsi="Times New Roman" w:eastAsia="Times New Roman"/>
+                <w:b/>
+                <w:color w:val="000000"/>
+                <w:sz w:val="22"/>
+              </w:rPr>
+              <w:t>TAC (ug/mL)</w:t>
+            </w:r>
+          </w:p>
+        </w:tc>
+      </w:tr>
+      <w:tr>
+        <w:tc>
+          <w:tcPr>
+            <w:tcW w:type="dxa" w:w="1183"/>
+          </w:tcPr>
+          <w:p>
+            <w:pPr>
+              <w:jc w:val="center"/>
+            </w:pPr>
+            <w:r>
+              <w:rPr>
+                <w:rFonts w:ascii="Times New Roman" w:hAnsi="Times New Roman" w:eastAsia="Times New Roman"/>
+                <w:b/>
+                <w:color w:val="000000"/>
+                <w:sz w:val="22"/>
+              </w:rPr>
+              <w:t>NG</w:t>
+            </w:r>
+          </w:p>
+        </w:tc>
+        <w:tc>
+          <w:tcPr>
+            <w:tcW w:type="dxa" w:w="1183"/>
+          </w:tcPr>
+          <w:p>
+            <w:pPr>
+              <w:jc w:val="center"/>
+            </w:pPr>
+            <w:r>
+              <w:rPr>
+                <w:rFonts w:ascii="Times New Roman" w:hAnsi="Times New Roman" w:eastAsia="Times New Roman"/>
+                <w:color w:val="000000"/>
+                <w:sz w:val="22"/>
+              </w:rPr>
+              <w:t>1.4842 ± 0.2724</w:t>
+            </w:r>
+          </w:p>
+        </w:tc>
+        <w:tc>
+          <w:tcPr>
+            <w:tcW w:type="dxa" w:w="1183"/>
+          </w:tcPr>
+          <w:p>
+            <w:pPr>
+              <w:jc w:val="center"/>
+            </w:pPr>
+            <w:r>
+              <w:rPr>
+                <w:rFonts w:ascii="Times New Roman" w:hAnsi="Times New Roman" w:eastAsia="Times New Roman"/>
+                <w:color w:val="000000"/>
+                <w:sz w:val="22"/>
+              </w:rPr>
+              <w:t>1.3069 ± 0.2573</w:t>
+            </w:r>
+          </w:p>
+        </w:tc>
+        <w:tc>
+          <w:tcPr>
+            <w:tcW w:type="dxa" w:w="1183"/>
+          </w:tcPr>
+          <w:p>
+            <w:pPr>
+              <w:jc w:val="center"/>
+            </w:pPr>
+            <w:r>
+              <w:rPr>
+                <w:rFonts w:ascii="Times New Roman" w:hAnsi="Times New Roman" w:eastAsia="Times New Roman"/>
+                <w:color w:val="000000"/>
+                <w:sz w:val="22"/>
+              </w:rPr>
+              <w:t>0.3285 ± 0.0443</w:t>
+            </w:r>
+          </w:p>
+        </w:tc>
+        <w:tc>
+          <w:tcPr>
+            <w:tcW w:type="dxa" w:w="1183"/>
+          </w:tcPr>
+          <w:p>
+            <w:pPr>
+              <w:jc w:val="center"/>
+            </w:pPr>
+            <w:r>
+              <w:rPr>
+                <w:rFonts w:ascii="Times New Roman" w:hAnsi="Times New Roman" w:eastAsia="Times New Roman"/>
+                <w:color w:val="000000"/>
+                <w:sz w:val="22"/>
+              </w:rPr>
+              <w:t>1.2797 ± 0.1573</w:t>
+            </w:r>
+          </w:p>
+        </w:tc>
+        <w:tc>
+          <w:tcPr>
+            <w:tcW w:type="dxa" w:w="1183"/>
+          </w:tcPr>
+          <w:p>
+            <w:pPr>
+              <w:jc w:val="center"/>
+            </w:pPr>
+            <w:r>
+              <w:rPr>
+                <w:rFonts w:ascii="Times New Roman" w:hAnsi="Times New Roman" w:eastAsia="Times New Roman"/>
+                <w:color w:val="000000"/>
+                <w:sz w:val="22"/>
+              </w:rPr>
+              <w:t>0.1893 ± 0.0693</w:t>
+            </w:r>
+          </w:p>
+        </w:tc>
+        <w:tc>
+          <w:tcPr>
+            <w:tcW w:type="dxa" w:w="1183"/>
+          </w:tcPr>
+          <w:p>
+            <w:pPr>
+              <w:jc w:val="center"/>
+            </w:pPr>
+            <w:r>
+              <w:rPr>
+                <w:rFonts w:ascii="Times New Roman" w:hAnsi="Times New Roman" w:eastAsia="Times New Roman"/>
+                <w:color w:val="000000"/>
+                <w:sz w:val="22"/>
+              </w:rPr>
+              <w:t>68.8525 ± 0.6825</w:t>
+            </w:r>
+          </w:p>
+        </w:tc>
+        <w:tc>
+          <w:tcPr>
+            <w:tcW w:type="dxa" w:w="1183"/>
+          </w:tcPr>
+          <w:p>
+            <w:pPr>
+              <w:jc w:val="center"/>
+            </w:pPr>
+            <w:r>
+              <w:rPr>
+                <w:rFonts w:ascii="Times New Roman" w:hAnsi="Times New Roman" w:eastAsia="Times New Roman"/>
+                <w:color w:val="000000"/>
+                <w:sz w:val="22"/>
+              </w:rPr>
+              <w:t>18.7946 ± 1.9104</w:t>
+            </w:r>
+          </w:p>
+        </w:tc>
+      </w:tr>
+      <w:tr>
+        <w:tc>
+          <w:tcPr>
+            <w:tcW w:type="dxa" w:w="1183"/>
+          </w:tcPr>
+          <w:p>
+            <w:pPr>
+              <w:jc w:val="center"/>
+            </w:pPr>
+            <w:r>
+              <w:rPr>
+                <w:rFonts w:ascii="Times New Roman" w:hAnsi="Times New Roman" w:eastAsia="Times New Roman"/>
+                <w:b/>
+                <w:color w:val="000000"/>
+                <w:sz w:val="22"/>
+              </w:rPr>
+              <w:t>MG</w:t>
+            </w:r>
+          </w:p>
+        </w:tc>
+        <w:tc>
+          <w:tcPr>
+            <w:tcW w:type="dxa" w:w="1183"/>
+          </w:tcPr>
+          <w:p>
+            <w:pPr>
+              <w:jc w:val="center"/>
+            </w:pPr>
+            <w:r>
+              <w:rPr>
+                <w:rFonts w:ascii="Times New Roman" w:hAnsi="Times New Roman" w:eastAsia="Times New Roman"/>
+                <w:color w:val="000000"/>
+                <w:sz w:val="22"/>
+              </w:rPr>
+              <w:t>1.3959 ± 0.2359</w:t>
+            </w:r>
+          </w:p>
+        </w:tc>
+        <w:tc>
+          <w:tcPr>
+            <w:tcW w:type="dxa" w:w="1183"/>
+          </w:tcPr>
+          <w:p>
+            <w:pPr>
+              <w:jc w:val="center"/>
+            </w:pPr>
+            <w:r>
+              <w:rPr>
+                <w:rFonts w:ascii="Times New Roman" w:hAnsi="Times New Roman" w:eastAsia="Times New Roman"/>
+                <w:color w:val="000000"/>
+                <w:sz w:val="22"/>
+              </w:rPr>
+              <w:t>1.4010 ± 0.2637</w:t>
+            </w:r>
+          </w:p>
+        </w:tc>
+        <w:tc>
+          <w:tcPr>
+            <w:tcW w:type="dxa" w:w="1183"/>
+          </w:tcPr>
+          <w:p>
+            <w:pPr>
+              <w:jc w:val="center"/>
+            </w:pPr>
+            <w:r>
+              <w:rPr>
+                <w:rFonts w:ascii="Times New Roman" w:hAnsi="Times New Roman" w:eastAsia="Times New Roman"/>
+                <w:color w:val="000000"/>
+                <w:sz w:val="22"/>
+              </w:rPr>
+              <w:t>0.4533 ± 0.0414</w:t>
+            </w:r>
+          </w:p>
+        </w:tc>
+        <w:tc>
+          <w:tcPr>
+            <w:tcW w:type="dxa" w:w="1183"/>
+          </w:tcPr>
+          <w:p>
+            <w:pPr>
+              <w:jc w:val="center"/>
+            </w:pPr>
+            <w:r>
+              <w:rPr>
+                <w:rFonts w:ascii="Times New Roman" w:hAnsi="Times New Roman" w:eastAsia="Times New Roman"/>
+                <w:color w:val="000000"/>
+                <w:sz w:val="22"/>
+              </w:rPr>
+              <w:t>1.1560 ± 0.0620</w:t>
+            </w:r>
+          </w:p>
+        </w:tc>
+        <w:tc>
+          <w:tcPr>
+            <w:tcW w:type="dxa" w:w="1183"/>
+          </w:tcPr>
+          <w:p>
+            <w:pPr>
+              <w:jc w:val="center"/>
+            </w:pPr>
+            <w:r>
+              <w:rPr>
+                <w:rFonts w:ascii="Times New Roman" w:hAnsi="Times New Roman" w:eastAsia="Times New Roman"/>
+                <w:color w:val="000000"/>
+                <w:sz w:val="22"/>
+              </w:rPr>
+              <w:t>0.1947 ± 0.0199</w:t>
+            </w:r>
+          </w:p>
+        </w:tc>
+        <w:tc>
+          <w:tcPr>
+            <w:tcW w:type="dxa" w:w="1183"/>
+          </w:tcPr>
+          <w:p>
+            <w:pPr>
+              <w:jc w:val="center"/>
+            </w:pPr>
+            <w:r>
+              <w:rPr>
+                <w:rFonts w:ascii="Times New Roman" w:hAnsi="Times New Roman" w:eastAsia="Times New Roman"/>
+                <w:color w:val="000000"/>
+                <w:sz w:val="22"/>
+              </w:rPr>
+              <w:t>69.9454 ± 0.5783</w:t>
+            </w:r>
+          </w:p>
+        </w:tc>
+        <w:tc>
+          <w:tcPr>
+            <w:tcW w:type="dxa" w:w="1183"/>
+          </w:tcPr>
+          <w:p>
+            <w:pPr>
+              <w:jc w:val="center"/>
+            </w:pPr>
+            <w:r>
+              <w:rPr>
+                <w:rFonts w:ascii="Times New Roman" w:hAnsi="Times New Roman" w:eastAsia="Times New Roman"/>
+                <w:color w:val="000000"/>
+                <w:sz w:val="22"/>
+              </w:rPr>
+              <w:t>17.0972 ± 0.6768</w:t>
+            </w:r>
+          </w:p>
+        </w:tc>
+      </w:tr>
+      <w:tr>
+        <w:tc>
+          <w:tcPr>
+            <w:tcW w:type="dxa" w:w="1183"/>
+          </w:tcPr>
+          <w:p>
+            <w:pPr>
+              <w:jc w:val="center"/>
+            </w:pPr>
+            <w:r>
+              <w:rPr>
+                <w:rFonts w:ascii="Times New Roman" w:hAnsi="Times New Roman" w:eastAsia="Times New Roman"/>
+                <w:b/>
+                <w:color w:val="000000"/>
+                <w:sz w:val="22"/>
+              </w:rPr>
+              <w:t>BL</w:t>
+            </w:r>
+          </w:p>
+        </w:tc>
+        <w:tc>
+          <w:tcPr>
+            <w:tcW w:type="dxa" w:w="1183"/>
+          </w:tcPr>
+          <w:p>
+            <w:pPr>
+              <w:jc w:val="center"/>
+            </w:pPr>
+            <w:r>
+              <w:rPr>
+                <w:rFonts w:ascii="Times New Roman" w:hAnsi="Times New Roman" w:eastAsia="Times New Roman"/>
+                <w:color w:val="000000"/>
+                <w:sz w:val="22"/>
+              </w:rPr>
+              <w:t>1.1510 ± 0.0737</w:t>
+            </w:r>
+          </w:p>
+        </w:tc>
+        <w:tc>
+          <w:tcPr>
+            <w:tcW w:type="dxa" w:w="1183"/>
+          </w:tcPr>
+          <w:p>
+            <w:pPr>
+              <w:jc w:val="center"/>
+            </w:pPr>
+            <w:r>
+              <w:rPr>
+                <w:rFonts w:ascii="Times New Roman" w:hAnsi="Times New Roman" w:eastAsia="Times New Roman"/>
+                <w:color w:val="000000"/>
+                <w:sz w:val="22"/>
+              </w:rPr>
+              <w:t>1.5926 ± 0.0894</w:t>
+            </w:r>
+          </w:p>
+        </w:tc>
+        <w:tc>
+          <w:tcPr>
+            <w:tcW w:type="dxa" w:w="1183"/>
+          </w:tcPr>
+          <w:p>
+            <w:pPr>
+              <w:jc w:val="center"/>
+            </w:pPr>
+            <w:r>
+              <w:rPr>
+                <w:rFonts w:ascii="Times New Roman" w:hAnsi="Times New Roman" w:eastAsia="Times New Roman"/>
+                <w:color w:val="000000"/>
+                <w:sz w:val="22"/>
+              </w:rPr>
+              <w:t>0.5541 ± 0.0509</w:t>
+            </w:r>
+          </w:p>
+        </w:tc>
+        <w:tc>
+          <w:tcPr>
+            <w:tcW w:type="dxa" w:w="1183"/>
+          </w:tcPr>
+          <w:p>
+            <w:pPr>
+              <w:jc w:val="center"/>
+            </w:pPr>
+            <w:r>
+              <w:rPr>
+                <w:rFonts w:ascii="Times New Roman" w:hAnsi="Times New Roman" w:eastAsia="Times New Roman"/>
+                <w:color w:val="000000"/>
+                <w:sz w:val="22"/>
+              </w:rPr>
+              <w:t>1.6304 ± 0.1136</w:t>
+            </w:r>
+          </w:p>
+        </w:tc>
+        <w:tc>
+          <w:tcPr>
+            <w:tcW w:type="dxa" w:w="1183"/>
+          </w:tcPr>
+          <w:p>
+            <w:pPr>
+              <w:jc w:val="center"/>
+            </w:pPr>
+            <w:r>
+              <w:rPr>
+                <w:rFonts w:ascii="Times New Roman" w:hAnsi="Times New Roman" w:eastAsia="Times New Roman"/>
+                <w:color w:val="000000"/>
+                <w:sz w:val="22"/>
+              </w:rPr>
+              <w:t>0.2652 ± 0.0208</w:t>
+            </w:r>
+          </w:p>
+        </w:tc>
+        <w:tc>
+          <w:tcPr>
+            <w:tcW w:type="dxa" w:w="1183"/>
+          </w:tcPr>
+          <w:p>
+            <w:pPr>
+              <w:jc w:val="center"/>
+            </w:pPr>
+            <w:r>
+              <w:rPr>
+                <w:rFonts w:ascii="Times New Roman" w:hAnsi="Times New Roman" w:eastAsia="Times New Roman"/>
+                <w:color w:val="000000"/>
+                <w:sz w:val="22"/>
+              </w:rPr>
+              <w:t>68.4809 ± 2.5697</w:t>
+            </w:r>
+          </w:p>
+        </w:tc>
+        <w:tc>
+          <w:tcPr>
+            <w:tcW w:type="dxa" w:w="1183"/>
+          </w:tcPr>
+          <w:p>
+            <w:pPr>
+              <w:jc w:val="center"/>
+            </w:pPr>
+            <w:r>
+              <w:rPr>
+                <w:rFonts w:ascii="Times New Roman" w:hAnsi="Times New Roman" w:eastAsia="Times New Roman"/>
+                <w:color w:val="000000"/>
+                <w:sz w:val="22"/>
+              </w:rPr>
+              <w:t>17.8401 ± 1.1793</w:t>
+            </w:r>
+          </w:p>
+        </w:tc>
+      </w:tr>
+      <w:tr>
+        <w:tc>
+          <w:tcPr>
+            <w:tcW w:type="dxa" w:w="1183"/>
+          </w:tcPr>
+          <w:p>
+            <w:pPr>
+              <w:jc w:val="center"/>
+            </w:pPr>
+            <w:r>
+              <w:rPr>
+                <w:rFonts w:ascii="Times New Roman" w:hAnsi="Times New Roman" w:eastAsia="Times New Roman"/>
+                <w:b/>
+                <w:color w:val="000000"/>
+                <w:sz w:val="22"/>
+              </w:rPr>
+              <w:t>IBU</w:t>
+            </w:r>
+          </w:p>
+        </w:tc>
+        <w:tc>
+          <w:tcPr>
+            <w:tcW w:type="dxa" w:w="1183"/>
+          </w:tcPr>
+          <w:p>
+            <w:pPr>
+              <w:jc w:val="center"/>
+            </w:pPr>
+            <w:r>
+              <w:rPr>
+                <w:rFonts w:ascii="Times New Roman" w:hAnsi="Times New Roman" w:eastAsia="Times New Roman"/>
+                <w:color w:val="000000"/>
+                <w:sz w:val="22"/>
+              </w:rPr>
+              <w:t>1.2966 ± 0.1628</w:t>
+            </w:r>
+          </w:p>
+        </w:tc>
+        <w:tc>
+          <w:tcPr>
+            <w:tcW w:type="dxa" w:w="1183"/>
+          </w:tcPr>
+          <w:p>
+            <w:pPr>
+              <w:jc w:val="center"/>
+            </w:pPr>
+            <w:r>
+              <w:rPr>
+                <w:rFonts w:ascii="Times New Roman" w:hAnsi="Times New Roman" w:eastAsia="Times New Roman"/>
+                <w:color w:val="000000"/>
+                <w:sz w:val="22"/>
+              </w:rPr>
+              <w:t>1.4709 ± 0.1637</w:t>
+            </w:r>
+          </w:p>
+        </w:tc>
+        <w:tc>
+          <w:tcPr>
+            <w:tcW w:type="dxa" w:w="1183"/>
+          </w:tcPr>
+          <w:p>
+            <w:pPr>
+              <w:jc w:val="center"/>
+            </w:pPr>
+            <w:r>
+              <w:rPr>
+                <w:rFonts w:ascii="Times New Roman" w:hAnsi="Times New Roman" w:eastAsia="Times New Roman"/>
+                <w:color w:val="000000"/>
+                <w:sz w:val="22"/>
+              </w:rPr>
+              <w:t>0.6145 ± 0.1466</w:t>
+            </w:r>
+          </w:p>
+        </w:tc>
+        <w:tc>
+          <w:tcPr>
+            <w:tcW w:type="dxa" w:w="1183"/>
+          </w:tcPr>
+          <w:p>
+            <w:pPr>
+              <w:jc w:val="center"/>
+            </w:pPr>
+            <w:r>
+              <w:rPr>
+                <w:rFonts w:ascii="Times New Roman" w:hAnsi="Times New Roman" w:eastAsia="Times New Roman"/>
+                <w:color w:val="000000"/>
+                <w:sz w:val="22"/>
+              </w:rPr>
+              <w:t>1.6081 ± 0.2754</w:t>
+            </w:r>
+          </w:p>
+        </w:tc>
+        <w:tc>
+          <w:tcPr>
+            <w:tcW w:type="dxa" w:w="1183"/>
+          </w:tcPr>
+          <w:p>
+            <w:pPr>
+              <w:jc w:val="center"/>
+            </w:pPr>
+            <w:r>
+              <w:rPr>
+                <w:rFonts w:ascii="Times New Roman" w:hAnsi="Times New Roman" w:eastAsia="Times New Roman"/>
+                <w:color w:val="000000"/>
+                <w:sz w:val="22"/>
+              </w:rPr>
+              <w:t>0.2377 ± 0.0524</w:t>
+            </w:r>
+          </w:p>
+        </w:tc>
+        <w:tc>
+          <w:tcPr>
+            <w:tcW w:type="dxa" w:w="1183"/>
+          </w:tcPr>
+          <w:p>
+            <w:pPr>
+              <w:jc w:val="center"/>
+            </w:pPr>
+            <w:r>
+              <w:rPr>
+                <w:rFonts w:ascii="Times New Roman" w:hAnsi="Times New Roman" w:eastAsia="Times New Roman"/>
+                <w:color w:val="000000"/>
+                <w:sz w:val="22"/>
+              </w:rPr>
+              <w:t>70.0546 ± 0.6085</w:t>
+            </w:r>
+          </w:p>
+        </w:tc>
+        <w:tc>
+          <w:tcPr>
+            <w:tcW w:type="dxa" w:w="1183"/>
+          </w:tcPr>
+          <w:p>
+            <w:pPr>
+              <w:jc w:val="center"/>
+            </w:pPr>
+            <w:r>
+              <w:rPr>
+                <w:rFonts w:ascii="Times New Roman" w:hAnsi="Times New Roman" w:eastAsia="Times New Roman"/>
+                <w:color w:val="000000"/>
+                <w:sz w:val="22"/>
+              </w:rPr>
+              <w:t>16.6544 ± 0.7918</w:t>
+            </w:r>
+          </w:p>
+        </w:tc>
+      </w:tr>
+      <w:tr>
+        <w:tc>
+          <w:tcPr>
+            <w:tcW w:type="dxa" w:w="1183"/>
+          </w:tcPr>
+          <w:p>
+            <w:pPr>
+              <w:jc w:val="center"/>
+            </w:pPr>
+            <w:r>
+              <w:rPr>
+                <w:rFonts w:ascii="Times New Roman" w:hAnsi="Times New Roman" w:eastAsia="Times New Roman"/>
+                <w:b/>
+                <w:color w:val="000000"/>
+                <w:sz w:val="22"/>
+              </w:rPr>
+              <w:t>CL</w:t>
+            </w:r>
+          </w:p>
+        </w:tc>
+        <w:tc>
+          <w:tcPr>
+            <w:tcW w:type="dxa" w:w="1183"/>
+          </w:tcPr>
+          <w:p>
+            <w:pPr>
+              <w:jc w:val="center"/>
+            </w:pPr>
+            <w:r>
+              <w:rPr>
+                <w:rFonts w:ascii="Times New Roman" w:hAnsi="Times New Roman" w:eastAsia="Times New Roman"/>
+                <w:color w:val="000000"/>
+                <w:sz w:val="22"/>
+              </w:rPr>
+              <w:t>1.1504 ± 0.2566</w:t>
+            </w:r>
+          </w:p>
+        </w:tc>
+        <w:tc>
+          <w:tcPr>
+            <w:tcW w:type="dxa" w:w="1183"/>
+          </w:tcPr>
+          <w:p>
+            <w:pPr>
+              <w:jc w:val="center"/>
+            </w:pPr>
+            <w:r>
+              <w:rPr>
+                <w:rFonts w:ascii="Times New Roman" w:hAnsi="Times New Roman" w:eastAsia="Times New Roman"/>
+                <w:color w:val="000000"/>
+                <w:sz w:val="22"/>
+              </w:rPr>
+              <w:t>1.6703 ± 0.3716</w:t>
+            </w:r>
+          </w:p>
+        </w:tc>
+        <w:tc>
+          <w:tcPr>
+            <w:tcW w:type="dxa" w:w="1183"/>
+          </w:tcPr>
+          <w:p>
+            <w:pPr>
+              <w:jc w:val="center"/>
+            </w:pPr>
+            <w:r>
+              <w:rPr>
+                <w:rFonts w:ascii="Times New Roman" w:hAnsi="Times New Roman" w:eastAsia="Times New Roman"/>
+                <w:color w:val="000000"/>
+                <w:sz w:val="22"/>
+              </w:rPr>
+              <w:t>0.5725 ± 0.0648</w:t>
+            </w:r>
+          </w:p>
+        </w:tc>
+        <w:tc>
+          <w:tcPr>
+            <w:tcW w:type="dxa" w:w="1183"/>
+          </w:tcPr>
+          <w:p>
+            <w:pPr>
+              <w:jc w:val="center"/>
+            </w:pPr>
+            <w:r>
+              <w:rPr>
+                <w:rFonts w:ascii="Times New Roman" w:hAnsi="Times New Roman" w:eastAsia="Times New Roman"/>
+                <w:color w:val="000000"/>
+                <w:sz w:val="22"/>
+              </w:rPr>
+              <w:t>1.7265 ± 0.3234</w:t>
+            </w:r>
+          </w:p>
+        </w:tc>
+        <w:tc>
+          <w:tcPr>
+            <w:tcW w:type="dxa" w:w="1183"/>
+          </w:tcPr>
+          <w:p>
+            <w:pPr>
+              <w:jc w:val="center"/>
+            </w:pPr>
+            <w:r>
+              <w:rPr>
+                <w:rFonts w:ascii="Times New Roman" w:hAnsi="Times New Roman" w:eastAsia="Times New Roman"/>
+                <w:color w:val="000000"/>
+                <w:sz w:val="22"/>
+              </w:rPr>
+              <w:t>0.2082 ± 0.0565</w:t>
+            </w:r>
+          </w:p>
+        </w:tc>
+        <w:tc>
+          <w:tcPr>
+            <w:tcW w:type="dxa" w:w="1183"/>
+          </w:tcPr>
+          <w:p>
+            <w:pPr>
+              <w:jc w:val="center"/>
+            </w:pPr>
+            <w:r>
+              <w:rPr>
+                <w:rFonts w:ascii="Times New Roman" w:hAnsi="Times New Roman" w:eastAsia="Times New Roman"/>
+                <w:color w:val="000000"/>
+                <w:sz w:val="22"/>
+              </w:rPr>
+              <w:t>69.1803 ± 0.9836</w:t>
+            </w:r>
+          </w:p>
+        </w:tc>
+        <w:tc>
+          <w:tcPr>
+            <w:tcW w:type="dxa" w:w="1183"/>
+          </w:tcPr>
+          <w:p>
+            <w:pPr>
+              <w:jc w:val="center"/>
+            </w:pPr>
+            <w:r>
+              <w:rPr>
+                <w:rFonts w:ascii="Times New Roman" w:hAnsi="Times New Roman" w:eastAsia="Times New Roman"/>
+                <w:color w:val="000000"/>
+                <w:sz w:val="22"/>
+              </w:rPr>
+              <w:t>20.4797 ± 5.2768</w:t>
+            </w:r>
+          </w:p>
+        </w:tc>
+      </w:tr>
+    </w:tbl>
     <w:p>
       <w:pPr>
         <w:pStyle w:val="Heading2"/>

</xml_diff>

<commit_message>
Update table styling in converter to include vertical lines and remove intermediate horizontal lines
</commit_message>
<xml_diff>
--- a/cleaning/VISUALIZATION_EXPLANATIONS.docx
+++ b/cleaning/VISUALIZATION_EXPLANATIONS.docx
@@ -65,9 +65,9 @@
         <w:tblBorders>
           <w:top w:val="single" w:sz="12" w:space="0" w:color="000000"/>
           <w:bottom w:val="single" w:sz="12" w:space="0" w:color="000000"/>
-          <w:left w:val="nil"/>
-          <w:right w:val="nil"/>
-          <w:insideV w:val="nil"/>
+          <w:left w:val="single" w:sz="6" w:space="0" w:color="000000"/>
+          <w:right w:val="single" w:sz="6" w:space="0" w:color="000000"/>
+          <w:insideV w:val="single" w:sz="6" w:space="0" w:color="000000"/>
           <w:insideH w:val="nil"/>
         </w:tblBorders>
       </w:tblPr>
@@ -884,9 +884,9 @@
         <w:tblBorders>
           <w:top w:val="single" w:sz="12" w:space="0" w:color="000000"/>
           <w:bottom w:val="single" w:sz="12" w:space="0" w:color="000000"/>
-          <w:left w:val="nil"/>
-          <w:right w:val="nil"/>
-          <w:insideV w:val="nil"/>
+          <w:left w:val="single" w:sz="6" w:space="0" w:color="000000"/>
+          <w:right w:val="single" w:sz="6" w:space="0" w:color="000000"/>
+          <w:insideV w:val="single" w:sz="6" w:space="0" w:color="000000"/>
           <w:insideH w:val="nil"/>
         </w:tblBorders>
       </w:tblPr>

</xml_diff>

<commit_message>
Update multi-panel layout to 2x4 horizontal grid with standing vertical bars
</commit_message>
<xml_diff>
--- a/cleaning/VISUALIZATION_EXPLANATIONS.docx
+++ b/cleaning/VISUALIZATION_EXPLANATIONS.docx
@@ -1865,7 +1865,7 @@
       <w:r>
         <w:drawing>
           <wp:inline xmlns:a="http://schemas.openxmlformats.org/drawingml/2006/main" xmlns:pic="http://schemas.openxmlformats.org/drawingml/2006/picture">
-            <wp:extent cx="4114800" cy="5290457"/>
+            <wp:extent cx="4114800" cy="1954530"/>
             <wp:docPr id="1" name="Picture 1"/>
             <wp:cNvGraphicFramePr>
               <a:graphicFrameLocks noChangeAspect="1"/>
@@ -1886,7 +1886,7 @@
                   <pic:spPr>
                     <a:xfrm>
                       <a:off x="0" y="0"/>
-                      <a:ext cx="4114800" cy="5290457"/>
+                      <a:ext cx="4114800" cy="1954530"/>
                     </a:xfrm>
                     <a:prstGeom prst="rect"/>
                   </pic:spPr>
@@ -1962,7 +1962,7 @@
       <w:r>
         <w:drawing>
           <wp:inline xmlns:a="http://schemas.openxmlformats.org/drawingml/2006/main" xmlns:pic="http://schemas.openxmlformats.org/drawingml/2006/picture">
-            <wp:extent cx="4114800" cy="5290457"/>
+            <wp:extent cx="4114800" cy="1954530"/>
             <wp:docPr id="2" name="Picture 2"/>
             <wp:cNvGraphicFramePr>
               <a:graphicFrameLocks noChangeAspect="1"/>
@@ -1983,7 +1983,7 @@
                   <pic:spPr>
                     <a:xfrm>
                       <a:off x="0" y="0"/>
-                      <a:ext cx="4114800" cy="5290457"/>
+                      <a:ext cx="4114800" cy="1954530"/>
                     </a:xfrm>
                     <a:prstGeom prst="rect"/>
                   </pic:spPr>

</xml_diff>

<commit_message>
Update visualizations with separate Clove/Bay Leaf correlation heatmaps and radar charts, removing run suffix
</commit_message>
<xml_diff>
--- a/cleaning/VISUALIZATION_EXPLANATIONS.docx
+++ b/cleaning/VISUALIZATION_EXPLANATIONS.docx
@@ -41,7 +41,7 @@
           <w:color w:val="000000"/>
           <w:sz w:val="24"/>
         </w:rPr>
-        <w:t>Biochemical parameters were evaluated across Clove and Bay Leaf runs. Table 3.1 summarizes the group means and standard errors for the parameters measured during the Clove run.</w:t>
+        <w:t>Biochemical parameters were evaluated across Clove and Bay Leaf assays. Table 3.1 summarizes the group means and standard errors for the parameters measured during the Clove assay.</w:t>
       </w:r>
     </w:p>
     <w:p>
@@ -55,7 +55,7 @@
           <w:color w:val="000000"/>
           <w:sz w:val="24"/>
         </w:rPr>
-        <w:t>Table 3.1: Group Means and Standard Errors (Clove Run)</w:t>
+        <w:t>Table 3.1: Group Means and Standard Errors (Clove Assay)</w:t>
       </w:r>
     </w:p>
     <w:tbl>
@@ -860,7 +860,7 @@
           <w:color w:val="000000"/>
           <w:sz w:val="24"/>
         </w:rPr>
-        <w:t>Table 3.2 summarizes the group means and standard errors for the parameters measured during the Bay Leaf run.</w:t>
+        <w:t>Table 3.2 summarizes the group means and standard errors for the parameters measured during the Bay Leaf assay.</w:t>
       </w:r>
     </w:p>
     <w:p>
@@ -874,7 +874,7 @@
           <w:color w:val="000000"/>
           <w:sz w:val="24"/>
         </w:rPr>
-        <w:t>Table 3.2: Group Means and Standard Errors (Bay Leaf Run)</w:t>
+        <w:t>Table 3.2: Group Means and Standard Errors (Bay Leaf Assay)</w:t>
       </w:r>
     </w:p>
     <w:tbl>
@@ -2117,7 +2117,7 @@
           <w:color w:val="000000"/>
           <w:sz w:val="22"/>
         </w:rPr>
-        <w:t>Figure 3.3: Superoxide Dismutase (SOD) activity distribution in Clove run.</w:t>
+        <w:t>Figure 3.3: Superoxide Dismutase (SOD) activity distribution in Clove assay.</w:t>
       </w:r>
     </w:p>
     <w:p>
@@ -2172,7 +2172,7 @@
           <w:color w:val="000000"/>
           <w:sz w:val="22"/>
         </w:rPr>
-        <w:t>Figure 3.4: Superoxide Dismutase (SOD) activity distribution in Bay Leaf run.</w:t>
+        <w:t>Figure 3.4: Superoxide Dismutase (SOD) activity distribution in Bay Leaf assay.</w:t>
       </w:r>
     </w:p>
     <w:p>
@@ -2186,7 +2186,7 @@
           <w:color w:val="000000"/>
           <w:sz w:val="24"/>
         </w:rPr>
-        <w:t>Clove superoxide dismutase distribution and Bay Leaf superoxide dismutase distribution are shown in the box plots above. In the clove run, the box plot shows that the healthy control animals form a tight cluster with high superoxide dismutase activity. The model control animals show a wider spread at a lower activity range. The clove treated animals display a compact distribution at the lowest superoxide dismutase activity level.</w:t>
+        <w:t>Clove superoxide dismutase distribution and Bay Leaf superoxide dismutase distribution are shown in the box plots above. In the clove assay, the box plot shows that the healthy control animals form a tight cluster with high superoxide dismutase activity. The model control animals show a wider spread at a lower activity range. The clove treated animals display a compact distribution at the lowest superoxide dismutase activity level.</w:t>
       </w:r>
     </w:p>
     <w:p>
@@ -2200,7 +2200,7 @@
           <w:color w:val="000000"/>
           <w:sz w:val="24"/>
         </w:rPr>
-        <w:t>In the bay leaf run, the box plot shows a wide distribution of values across all groups. Individual animals in the normal control group overlap with those in the model control group. The large overlap explains the lack of statistical significance in this run.</w:t>
+        <w:t>In the bay leaf assay, the box plot shows a wide distribution of values across all groups. Individual animals in the normal control group overlap with those in the model control group. The large overlap explains the lack of statistical significance in this assay.</w:t>
       </w:r>
     </w:p>
     <w:p>
@@ -2269,7 +2269,7 @@
           <w:color w:val="000000"/>
           <w:sz w:val="22"/>
         </w:rPr>
-        <w:t>Figure 3.5: Malondialdehyde (MDA) concentration distribution in Clove run.</w:t>
+        <w:t>Figure 3.5: Malondialdehyde (MDA) concentration distribution in Clove assay.</w:t>
       </w:r>
     </w:p>
     <w:p>
@@ -2324,7 +2324,7 @@
           <w:color w:val="000000"/>
           <w:sz w:val="22"/>
         </w:rPr>
-        <w:t>Figure 3.6: Malondialdehyde (MDA) concentration distribution in Bay Leaf run.</w:t>
+        <w:t>Figure 3.6: Malondialdehyde (MDA) concentration distribution in Bay Leaf assay.</w:t>
       </w:r>
     </w:p>
     <w:p>
@@ -2338,7 +2338,7 @@
           <w:color w:val="000000"/>
           <w:sz w:val="24"/>
         </w:rPr>
-        <w:t>Clove malondialdehyde distribution and Bay Leaf malondialdehyde distribution are presented in the box plots above. In the clove run, healthy control animals have a median malondialdehyde value of 0.3166 mol/g Prot. The model control animals have a median malondialdehyde value of 0.1549 mol/g Prot. The clove treated group shows a median malondialdehyde value of 0.3661 mol/g Prot, with individual values ranging from 0.1902 to 1.8821 mol/g Prot.</w:t>
+        <w:t>Clove malondialdehyde distribution and Bay Leaf malondialdehyde distribution are presented in the box plots above. In the clove assay, healthy control animals have a median malondialdehyde value of 0.3166 mol/g Prot. The model control animals have a median malondialdehyde value of 0.1549 mol/g Prot. The clove treated group shows a median malondialdehyde value of 0.3661 mol/g Prot, with individual values ranging from 0.1902 to 1.8821 mol/g Prot.</w:t>
       </w:r>
     </w:p>
     <w:p>
@@ -2352,7 +2352,7 @@
           <w:color w:val="000000"/>
           <w:sz w:val="24"/>
         </w:rPr>
-        <w:t>In the bay leaf run, the box plot reveals similar median values between the normal control and model control groups. The bay leaf treated group shows a median malondialdehyde value of 0.2753 mol/g Prot, with a wide distribution.</w:t>
+        <w:t>In the bay leaf assay, the box plot reveals similar median values between the normal control and model control groups. The bay leaf treated group shows a median malondialdehyde value of 0.2753 mol/g Prot, with a wide distribution.</w:t>
       </w:r>
     </w:p>
     <w:p>
@@ -2385,6 +2385,20 @@
     </w:p>
     <w:p>
       <w:pPr>
+        <w:pStyle w:val="Heading3"/>
+        <w:jc w:val="both"/>
+      </w:pPr>
+      <w:r>
+        <w:rPr>
+          <w:rFonts w:ascii="Times New Roman" w:hAnsi="Times New Roman" w:eastAsia="Times New Roman"/>
+          <w:color w:val="000000"/>
+          <w:sz w:val="24"/>
+        </w:rPr>
+        <w:t>Figure 3.7: Heatmap representing Pearson correlation coefficients (r) for Clove assay.</w:t>
+      </w:r>
+    </w:p>
+    <w:p>
+      <w:pPr>
         <w:spacing w:before="240"/>
         <w:jc w:val="center"/>
       </w:pPr>
@@ -2400,7 +2414,7 @@
               <a:graphicData uri="http://schemas.openxmlformats.org/drawingml/2006/picture">
                 <pic:pic>
                   <pic:nvPicPr>
-                    <pic:cNvPr id="0" name="markers_correlation_heatmap.png"/>
+                    <pic:cNvPr id="0" name="clove_correlation_heatmap.png"/>
                     <pic:cNvPicPr/>
                   </pic:nvPicPr>
                   <pic:blipFill>
@@ -2435,7 +2449,76 @@
           <w:color w:val="000000"/>
           <w:sz w:val="22"/>
         </w:rPr>
-        <w:t>Figure 3.7: Heatmap representing Pearson correlation coefficients (r) between all biochemical markers.</w:t>
+        <w:t>Figure 3.7: Heatmap representing Pearson correlation coefficients (r) for Clove assay.</w:t>
+      </w:r>
+    </w:p>
+    <w:p>
+      <w:pPr>
+        <w:pStyle w:val="Heading3"/>
+        <w:jc w:val="both"/>
+      </w:pPr>
+      <w:r>
+        <w:rPr>
+          <w:rFonts w:ascii="Times New Roman" w:hAnsi="Times New Roman" w:eastAsia="Times New Roman"/>
+          <w:color w:val="000000"/>
+          <w:sz w:val="24"/>
+        </w:rPr>
+        <w:t>Figure 3.8: Heatmap representing Pearson correlation coefficients (r) for Bay Leaf assay.</w:t>
+      </w:r>
+    </w:p>
+    <w:p>
+      <w:pPr>
+        <w:spacing w:before="240"/>
+        <w:jc w:val="center"/>
+      </w:pPr>
+      <w:r>
+        <w:drawing>
+          <wp:inline xmlns:a="http://schemas.openxmlformats.org/drawingml/2006/main" xmlns:pic="http://schemas.openxmlformats.org/drawingml/2006/picture">
+            <wp:extent cx="4114800" cy="3200400"/>
+            <wp:docPr id="8" name="Picture 8"/>
+            <wp:cNvGraphicFramePr>
+              <a:graphicFrameLocks noChangeAspect="1"/>
+            </wp:cNvGraphicFramePr>
+            <a:graphic>
+              <a:graphicData uri="http://schemas.openxmlformats.org/drawingml/2006/picture">
+                <pic:pic>
+                  <pic:nvPicPr>
+                    <pic:cNvPr id="0" name="bay_leaf_correlation_heatmap.png"/>
+                    <pic:cNvPicPr/>
+                  </pic:nvPicPr>
+                  <pic:blipFill>
+                    <a:blip r:embed="rId17"/>
+                    <a:stretch>
+                      <a:fillRect/>
+                    </a:stretch>
+                  </pic:blipFill>
+                  <pic:spPr>
+                    <a:xfrm>
+                      <a:off x="0" y="0"/>
+                      <a:ext cx="4114800" cy="3200400"/>
+                    </a:xfrm>
+                    <a:prstGeom prst="rect"/>
+                  </pic:spPr>
+                </pic:pic>
+              </a:graphicData>
+            </a:graphic>
+          </wp:inline>
+        </w:drawing>
+      </w:r>
+    </w:p>
+    <w:p>
+      <w:pPr>
+        <w:spacing w:after="240"/>
+        <w:jc w:val="center"/>
+      </w:pPr>
+      <w:r>
+        <w:rPr>
+          <w:rFonts w:ascii="Times New Roman" w:hAnsi="Times New Roman" w:eastAsia="Times New Roman"/>
+          <w:i/>
+          <w:color w:val="000000"/>
+          <w:sz w:val="22"/>
+        </w:rPr>
+        <w:t>Figure 3.8: Heatmap representing Pearson correlation coefficients (r) for Bay Leaf assay.</w:t>
       </w:r>
     </w:p>
     <w:p>
@@ -2449,7 +2532,7 @@
           <w:color w:val="000000"/>
           <w:sz w:val="24"/>
         </w:rPr>
-        <w:t>In this heatmap, the correlation values were calculated using all combined animal data from the clove and bay leaf runs.</w:t>
+        <w:t>In the Clove assay (Figure 3.7), the antioxidant enzymes (SOD, CAT, and GPx) show a very strong positive correlation with each other (SOD vs CAT = 0.912, SOD vs GPx = 0.828, CAT vs GPx = 0.757). The primary enzymatic defense lines shift in a coordinated manner. In the Bay Leaf assay (Figure 3.8), a similar positive correlation exists (SOD vs GPx = 0.595, CAT vs GPx = 0.661).</w:t>
       </w:r>
     </w:p>
     <w:p>
@@ -2463,7 +2546,7 @@
           <w:color w:val="000000"/>
           <w:sz w:val="24"/>
         </w:rPr>
-        <w:t>Catalase and glutathione peroxidase exhibit a positive correlation of 0.702. This indicates that their activity levels tend to change in the same direction. These two enzymes work cooperatively to clear hydrogen peroxide from tissue.</w:t>
+        <w:t>In both assays, total protein is strongly negatively correlated with SOD, CAT, and GPx activity levels. This is a mathematical result of normalization, as these enzyme activities are expressed per gram of protein (U/g Prot).</w:t>
       </w:r>
     </w:p>
     <w:p>
@@ -2477,35 +2560,7 @@
           <w:color w:val="000000"/>
           <w:sz w:val="24"/>
         </w:rPr>
-        <w:t>Superoxide dismutase and glutathione peroxidase display a positive correlation of 0.493. This represents another coordinated shift in the enzymatic defense system.</w:t>
-      </w:r>
-    </w:p>
-    <w:p>
-      <w:pPr>
-        <w:spacing w:line="360" w:lineRule="auto" w:after="0"/>
-        <w:jc w:val="both"/>
-      </w:pPr>
-      <w:r>
-        <w:rPr>
-          <w:rFonts w:ascii="Times New Roman" w:hAnsi="Times New Roman" w:eastAsia="Times New Roman"/>
-          <w:color w:val="000000"/>
-          <w:sz w:val="24"/>
-        </w:rPr>
-        <w:t>Total protein and catalase have a negative correlation of -0.744. Total protein and glutathione peroxidase have a negative correlation of -0.649. This indicates that higher total protein concentrations are associated with lower measured activities of these two enzymes per gram of protein.</w:t>
-      </w:r>
-    </w:p>
-    <w:p>
-      <w:pPr>
-        <w:spacing w:line="360" w:lineRule="auto" w:after="0"/>
-        <w:jc w:val="both"/>
-      </w:pPr>
-      <w:r>
-        <w:rPr>
-          <w:rFonts w:ascii="Times New Roman" w:hAnsi="Times New Roman" w:eastAsia="Times New Roman"/>
-          <w:color w:val="000000"/>
-          <w:sz w:val="24"/>
-        </w:rPr>
-        <w:t>Malondialdehyde and reduced glutathione have a negative correlation of -0.094. This indicates that higher levels of cell damage are associated with lower levels of the protective antioxidant glutathione.</w:t>
+        <w:t>Malondialdehyde shows a negative correlation with reduced glutathione (-0.141 in Clove, -0.054 in Bay Leaf). High lipid peroxidation is associated with glutathione consumption.</w:t>
       </w:r>
     </w:p>
     <w:p>
@@ -2533,7 +2588,21 @@
           <w:color w:val="000000"/>
           <w:sz w:val="24"/>
         </w:rPr>
-        <w:t>The radar chart displays the normalized mean values of all seven parameters on a single circular axis. The healthy control, model control, and treatment groups form distinct geometric shapes. This chart provides a holistic view of the protective profile of the clove extract compared to the healthy and model states.</w:t>
+        <w:t>The radar charts display the normalized mean values of all seven parameters on a single circular axis. The healthy control, model control, and treatment groups form distinct geometric shapes. This provides a holistic view of the biometric profile of the treatments compared to the healthy and model states.</w:t>
+      </w:r>
+    </w:p>
+    <w:p>
+      <w:pPr>
+        <w:pStyle w:val="Heading3"/>
+        <w:jc w:val="both"/>
+      </w:pPr>
+      <w:r>
+        <w:rPr>
+          <w:rFonts w:ascii="Times New Roman" w:hAnsi="Times New Roman" w:eastAsia="Times New Roman"/>
+          <w:color w:val="000000"/>
+          <w:sz w:val="24"/>
+        </w:rPr>
+        <w:t>Figure 3.9: Radar chart representing the normalized biometric profiles of Clove extract treated cohorts.</w:t>
       </w:r>
     </w:p>
     <w:p>
@@ -2545,7 +2614,7 @@
         <w:drawing>
           <wp:inline xmlns:a="http://schemas.openxmlformats.org/drawingml/2006/main" xmlns:pic="http://schemas.openxmlformats.org/drawingml/2006/picture">
             <wp:extent cx="4114800" cy="4114800"/>
-            <wp:docPr id="8" name="Picture 8"/>
+            <wp:docPr id="9" name="Picture 9"/>
             <wp:cNvGraphicFramePr>
               <a:graphicFrameLocks noChangeAspect="1"/>
             </wp:cNvGraphicFramePr>
@@ -2557,7 +2626,7 @@
                     <pic:cNvPicPr/>
                   </pic:nvPicPr>
                   <pic:blipFill>
-                    <a:blip r:embed="rId17"/>
+                    <a:blip r:embed="rId18"/>
                     <a:stretch>
                       <a:fillRect/>
                     </a:stretch>
@@ -2588,7 +2657,76 @@
           <w:color w:val="000000"/>
           <w:sz w:val="22"/>
         </w:rPr>
-        <w:t>Figure 3.8: Radar chart representing the normalized biometric profiles of Clove extract treated cohorts.</w:t>
+        <w:t>Figure 3.9: Radar chart representing the normalized biometric profiles of Clove extract treated cohorts.</w:t>
+      </w:r>
+    </w:p>
+    <w:p>
+      <w:pPr>
+        <w:pStyle w:val="Heading3"/>
+        <w:jc w:val="both"/>
+      </w:pPr>
+      <w:r>
+        <w:rPr>
+          <w:rFonts w:ascii="Times New Roman" w:hAnsi="Times New Roman" w:eastAsia="Times New Roman"/>
+          <w:color w:val="000000"/>
+          <w:sz w:val="24"/>
+        </w:rPr>
+        <w:t>Figure 3.10: Radar chart representing the normalized biometric profiles of Bay Leaf extract treated cohorts.</w:t>
+      </w:r>
+    </w:p>
+    <w:p>
+      <w:pPr>
+        <w:spacing w:before="240"/>
+        <w:jc w:val="center"/>
+      </w:pPr>
+      <w:r>
+        <w:drawing>
+          <wp:inline xmlns:a="http://schemas.openxmlformats.org/drawingml/2006/main" xmlns:pic="http://schemas.openxmlformats.org/drawingml/2006/picture">
+            <wp:extent cx="4114800" cy="4114800"/>
+            <wp:docPr id="10" name="Picture 10"/>
+            <wp:cNvGraphicFramePr>
+              <a:graphicFrameLocks noChangeAspect="1"/>
+            </wp:cNvGraphicFramePr>
+            <a:graphic>
+              <a:graphicData uri="http://schemas.openxmlformats.org/drawingml/2006/picture">
+                <pic:pic>
+                  <pic:nvPicPr>
+                    <pic:cNvPr id="0" name="bay_leaf_markers_radar_chart.png"/>
+                    <pic:cNvPicPr/>
+                  </pic:nvPicPr>
+                  <pic:blipFill>
+                    <a:blip r:embed="rId19"/>
+                    <a:stretch>
+                      <a:fillRect/>
+                    </a:stretch>
+                  </pic:blipFill>
+                  <pic:spPr>
+                    <a:xfrm>
+                      <a:off x="0" y="0"/>
+                      <a:ext cx="4114800" cy="4114800"/>
+                    </a:xfrm>
+                    <a:prstGeom prst="rect"/>
+                  </pic:spPr>
+                </pic:pic>
+              </a:graphicData>
+            </a:graphic>
+          </wp:inline>
+        </w:drawing>
+      </w:r>
+    </w:p>
+    <w:p>
+      <w:pPr>
+        <w:spacing w:after="240"/>
+        <w:jc w:val="center"/>
+      </w:pPr>
+      <w:r>
+        <w:rPr>
+          <w:rFonts w:ascii="Times New Roman" w:hAnsi="Times New Roman" w:eastAsia="Times New Roman"/>
+          <w:i/>
+          <w:color w:val="000000"/>
+          <w:sz w:val="22"/>
+        </w:rPr>
+        <w:t>Figure 3.10: Radar chart representing the normalized biometric profiles of Bay Leaf extract treated cohorts.</w:t>
       </w:r>
     </w:p>
     <w:p>
@@ -2602,7 +2740,21 @@
           <w:color w:val="000000"/>
           <w:sz w:val="24"/>
         </w:rPr>
-        <w:t>The radar chart maps the normalized mean values of the seven parameters on a single circular axis. The normal control group forms a distinct geometric shape characterized by high antioxidant levels. The model control group displays a shifted shape that highlights the depletion of superoxide dismutase and catalase. The clove treated group forms a shape that overlaps with the model control group, indicating a lack of protective recovery.</w:t>
+        <w:t>In the Clove assay (Figure 3.9), the normal control group maintains high antioxidant levels. The model control group shows significant depletion. The clove-treated group forms a shape that overlaps with the model control group, showing a lack of protective recovery.</w:t>
+      </w:r>
+    </w:p>
+    <w:p>
+      <w:pPr>
+        <w:spacing w:line="360" w:lineRule="auto" w:after="0"/>
+        <w:jc w:val="both"/>
+      </w:pPr>
+      <w:r>
+        <w:rPr>
+          <w:rFonts w:ascii="Times New Roman" w:hAnsi="Times New Roman" w:eastAsia="Times New Roman"/>
+          <w:color w:val="000000"/>
+          <w:sz w:val="24"/>
+        </w:rPr>
+        <w:t>In the Bay Leaf assay (Figure 3.10), the normal control and model control groups have similar normalized biometric profiles. The bay leaf-treated group shows a distinct shape with slightly higher levels of SOD, CAT, and GPx, though these differences are statistically non-significant.</w:t>
       </w:r>
     </w:p>
     <w:sectPr>

</xml_diff>

<commit_message>
Refactor statistical analysis to use One-Way ANOVA and Tukey's HSD post-hoc test, adding Extract vs. Ibuprofen comparison p-values to Excel and Word document tables
</commit_message>
<xml_diff>
--- a/cleaning/VISUALIZATION_EXPLANATIONS.docx
+++ b/cleaning/VISUALIZATION_EXPLANATIONS.docx
@@ -41,7 +41,7 @@
           <w:color w:val="000000"/>
           <w:sz w:val="24"/>
         </w:rPr>
-        <w:t>Biochemical parameters were evaluated across Clove and Bay Leaf assays. Table 3.1 summarizes the group means and standard errors for the parameters measured during the Clove assay.</w:t>
+        <w:t>Biochemical parameters were evaluated across Clove and Bay Leaf assays. Table 3.1 summarizes the group means, standard errors, and Tukey-adjusted comparison p-values for the parameters measured during the Clove assay.</w:t>
       </w:r>
     </w:p>
     <w:p>
@@ -55,7 +55,7 @@
           <w:color w:val="000000"/>
           <w:sz w:val="24"/>
         </w:rPr>
-        <w:t>Table 3.1: Group Means and Standard Errors (Clove Assay)</w:t>
+        <w:t>Table 3.1: Group Means, Standard Errors, and Pairwise Tukey p-values (Clove Assay)</w:t>
       </w:r>
     </w:p>
     <w:tbl>
@@ -101,7 +101,7 @@
                 <w:color w:val="000000"/>
                 <w:sz w:val="22"/>
               </w:rPr>
-              <w:t>Group</w:t>
+              <w:t>Group / Comparison</w:t>
             </w:r>
           </w:p>
         </w:tc>
@@ -276,7 +276,7 @@
                 <w:color w:val="000000"/>
                 <w:sz w:val="22"/>
               </w:rPr>
-              <w:t>NC</w:t>
+              <w:t>NC (Normal Control)</w:t>
             </w:r>
           </w:p>
         </w:tc>
@@ -423,7 +423,7 @@
                 <w:color w:val="000000"/>
                 <w:sz w:val="22"/>
               </w:rPr>
-              <w:t>MC</w:t>
+              <w:t>MC (Model Control)</w:t>
             </w:r>
           </w:p>
         </w:tc>
@@ -570,7 +570,7 @@
                 <w:color w:val="000000"/>
                 <w:sz w:val="22"/>
               </w:rPr>
-              <w:t>CL</w:t>
+              <w:t>CL (Clove Extract)</w:t>
             </w:r>
           </w:p>
         </w:tc>
@@ -588,7 +588,7 @@
                 <w:color w:val="000000"/>
                 <w:sz w:val="22"/>
               </w:rPr>
-              <w:t>0.9114 ± 0.0576</w:t>
+              <w:t>0.8795 ± 0.0553</w:t>
             </w:r>
           </w:p>
         </w:tc>
@@ -606,7 +606,7 @@
                 <w:color w:val="000000"/>
                 <w:sz w:val="22"/>
               </w:rPr>
-              <w:t>1.1535 ± 0.0764</w:t>
+              <w:t>1.0846 ± 0.0580</w:t>
             </w:r>
           </w:p>
         </w:tc>
@@ -624,7 +624,7 @@
                 <w:color w:val="000000"/>
                 <w:sz w:val="22"/>
               </w:rPr>
-              <w:t>0.8102 ± 0.0535</w:t>
+              <w:t>0.8419 ± 0.0552</w:t>
             </w:r>
           </w:p>
         </w:tc>
@@ -642,7 +642,7 @@
                 <w:color w:val="000000"/>
                 <w:sz w:val="22"/>
               </w:rPr>
-              <w:t>1.5567 ± 0.0970</w:t>
+              <w:t>1.5340 ± 0.1043</w:t>
             </w:r>
           </w:p>
         </w:tc>
@@ -660,7 +660,7 @@
                 <w:color w:val="000000"/>
                 <w:sz w:val="22"/>
               </w:rPr>
-              <w:t>0.4470 ± 0.0953</w:t>
+              <w:t>0.4788 ± 0.1054</w:t>
             </w:r>
           </w:p>
         </w:tc>
@@ -678,7 +678,7 @@
                 <w:color w:val="000000"/>
                 <w:sz w:val="22"/>
               </w:rPr>
-              <w:t>68.1196 ± 1.1053</w:t>
+              <w:t>67.9781 ± 1.2494</w:t>
             </w:r>
           </w:p>
         </w:tc>
@@ -696,7 +696,7 @@
                 <w:color w:val="000000"/>
                 <w:sz w:val="22"/>
               </w:rPr>
-              <w:t>37.4126 ± 2.5205</w:t>
+              <w:t>39.6704 ± 2.2065</w:t>
             </w:r>
           </w:p>
         </w:tc>
@@ -717,7 +717,7 @@
                 <w:color w:val="000000"/>
                 <w:sz w:val="22"/>
               </w:rPr>
-              <w:t>IB</w:t>
+              <w:t>IB (Ibuprofen)</w:t>
             </w:r>
           </w:p>
         </w:tc>
@@ -848,6 +848,594 @@
           </w:p>
         </w:tc>
       </w:tr>
+      <w:tr>
+        <w:tc>
+          <w:tcPr>
+            <w:tcW w:type="dxa" w:w="1183"/>
+          </w:tcPr>
+          <w:p>
+            <w:pPr>
+              <w:jc w:val="center"/>
+            </w:pPr>
+            <w:r>
+              <w:rPr>
+                <w:rFonts w:ascii="Times New Roman" w:hAnsi="Times New Roman" w:eastAsia="Times New Roman"/>
+                <w:b/>
+                <w:color w:val="000000"/>
+                <w:sz w:val="22"/>
+              </w:rPr>
+              <w:t>p-value (MC vs NC)</w:t>
+            </w:r>
+          </w:p>
+        </w:tc>
+        <w:tc>
+          <w:tcPr>
+            <w:tcW w:type="dxa" w:w="1183"/>
+          </w:tcPr>
+          <w:p>
+            <w:pPr>
+              <w:jc w:val="center"/>
+            </w:pPr>
+            <w:r>
+              <w:rPr>
+                <w:rFonts w:ascii="Times New Roman" w:hAnsi="Times New Roman" w:eastAsia="Times New Roman"/>
+                <w:color w:val="000000"/>
+                <w:sz w:val="22"/>
+              </w:rPr>
+              <w:t>0.5915 (ns)</w:t>
+            </w:r>
+          </w:p>
+        </w:tc>
+        <w:tc>
+          <w:tcPr>
+            <w:tcW w:type="dxa" w:w="1183"/>
+          </w:tcPr>
+          <w:p>
+            <w:pPr>
+              <w:jc w:val="center"/>
+            </w:pPr>
+            <w:r>
+              <w:rPr>
+                <w:rFonts w:ascii="Times New Roman" w:hAnsi="Times New Roman" w:eastAsia="Times New Roman"/>
+                <w:color w:val="000000"/>
+                <w:sz w:val="22"/>
+              </w:rPr>
+              <w:t>0.0374 *</w:t>
+            </w:r>
+          </w:p>
+        </w:tc>
+        <w:tc>
+          <w:tcPr>
+            <w:tcW w:type="dxa" w:w="1183"/>
+          </w:tcPr>
+          <w:p>
+            <w:pPr>
+              <w:jc w:val="center"/>
+            </w:pPr>
+            <w:r>
+              <w:rPr>
+                <w:rFonts w:ascii="Times New Roman" w:hAnsi="Times New Roman" w:eastAsia="Times New Roman"/>
+                <w:color w:val="000000"/>
+                <w:sz w:val="22"/>
+              </w:rPr>
+              <w:t>0.0673 (ns)</w:t>
+            </w:r>
+          </w:p>
+        </w:tc>
+        <w:tc>
+          <w:tcPr>
+            <w:tcW w:type="dxa" w:w="1183"/>
+          </w:tcPr>
+          <w:p>
+            <w:pPr>
+              <w:jc w:val="center"/>
+            </w:pPr>
+            <w:r>
+              <w:rPr>
+                <w:rFonts w:ascii="Times New Roman" w:hAnsi="Times New Roman" w:eastAsia="Times New Roman"/>
+                <w:color w:val="000000"/>
+                <w:sz w:val="22"/>
+              </w:rPr>
+              <w:t>0.3969 (ns)</w:t>
+            </w:r>
+          </w:p>
+        </w:tc>
+        <w:tc>
+          <w:tcPr>
+            <w:tcW w:type="dxa" w:w="1183"/>
+          </w:tcPr>
+          <w:p>
+            <w:pPr>
+              <w:jc w:val="center"/>
+            </w:pPr>
+            <w:r>
+              <w:rPr>
+                <w:rFonts w:ascii="Times New Roman" w:hAnsi="Times New Roman" w:eastAsia="Times New Roman"/>
+                <w:color w:val="000000"/>
+                <w:sz w:val="22"/>
+              </w:rPr>
+              <w:t>0.8418 (ns)</w:t>
+            </w:r>
+          </w:p>
+        </w:tc>
+        <w:tc>
+          <w:tcPr>
+            <w:tcW w:type="dxa" w:w="1183"/>
+          </w:tcPr>
+          <w:p>
+            <w:pPr>
+              <w:jc w:val="center"/>
+            </w:pPr>
+            <w:r>
+              <w:rPr>
+                <w:rFonts w:ascii="Times New Roman" w:hAnsi="Times New Roman" w:eastAsia="Times New Roman"/>
+                <w:color w:val="000000"/>
+                <w:sz w:val="22"/>
+              </w:rPr>
+              <w:t>0.9981 (ns)</w:t>
+            </w:r>
+          </w:p>
+        </w:tc>
+        <w:tc>
+          <w:tcPr>
+            <w:tcW w:type="dxa" w:w="1183"/>
+          </w:tcPr>
+          <w:p>
+            <w:pPr>
+              <w:jc w:val="center"/>
+            </w:pPr>
+            <w:r>
+              <w:rPr>
+                <w:rFonts w:ascii="Times New Roman" w:hAnsi="Times New Roman" w:eastAsia="Times New Roman"/>
+                <w:color w:val="000000"/>
+                <w:sz w:val="22"/>
+              </w:rPr>
+              <w:t>0.3713 (ns)</w:t>
+            </w:r>
+          </w:p>
+        </w:tc>
+      </w:tr>
+      <w:tr>
+        <w:tc>
+          <w:tcPr>
+            <w:tcW w:type="dxa" w:w="1183"/>
+          </w:tcPr>
+          <w:p>
+            <w:pPr>
+              <w:jc w:val="center"/>
+            </w:pPr>
+            <w:r>
+              <w:rPr>
+                <w:rFonts w:ascii="Times New Roman" w:hAnsi="Times New Roman" w:eastAsia="Times New Roman"/>
+                <w:b/>
+                <w:color w:val="000000"/>
+                <w:sz w:val="22"/>
+              </w:rPr>
+              <w:t>p-value (CL vs MC)</w:t>
+            </w:r>
+          </w:p>
+        </w:tc>
+        <w:tc>
+          <w:tcPr>
+            <w:tcW w:type="dxa" w:w="1183"/>
+          </w:tcPr>
+          <w:p>
+            <w:pPr>
+              <w:jc w:val="center"/>
+            </w:pPr>
+            <w:r>
+              <w:rPr>
+                <w:rFonts w:ascii="Times New Roman" w:hAnsi="Times New Roman" w:eastAsia="Times New Roman"/>
+                <w:color w:val="000000"/>
+                <w:sz w:val="22"/>
+              </w:rPr>
+              <w:t>0.6888 (ns)</w:t>
+            </w:r>
+          </w:p>
+        </w:tc>
+        <w:tc>
+          <w:tcPr>
+            <w:tcW w:type="dxa" w:w="1183"/>
+          </w:tcPr>
+          <w:p>
+            <w:pPr>
+              <w:jc w:val="center"/>
+            </w:pPr>
+            <w:r>
+              <w:rPr>
+                <w:rFonts w:ascii="Times New Roman" w:hAnsi="Times New Roman" w:eastAsia="Times New Roman"/>
+                <w:color w:val="000000"/>
+                <w:sz w:val="22"/>
+              </w:rPr>
+              <w:t>0.1845 (ns)</w:t>
+            </w:r>
+          </w:p>
+        </w:tc>
+        <w:tc>
+          <w:tcPr>
+            <w:tcW w:type="dxa" w:w="1183"/>
+          </w:tcPr>
+          <w:p>
+            <w:pPr>
+              <w:jc w:val="center"/>
+            </w:pPr>
+            <w:r>
+              <w:rPr>
+                <w:rFonts w:ascii="Times New Roman" w:hAnsi="Times New Roman" w:eastAsia="Times New Roman"/>
+                <w:color w:val="000000"/>
+                <w:sz w:val="22"/>
+              </w:rPr>
+              <w:t>0.4567 (ns)</w:t>
+            </w:r>
+          </w:p>
+        </w:tc>
+        <w:tc>
+          <w:tcPr>
+            <w:tcW w:type="dxa" w:w="1183"/>
+          </w:tcPr>
+          <w:p>
+            <w:pPr>
+              <w:jc w:val="center"/>
+            </w:pPr>
+            <w:r>
+              <w:rPr>
+                <w:rFonts w:ascii="Times New Roman" w:hAnsi="Times New Roman" w:eastAsia="Times New Roman"/>
+                <w:color w:val="000000"/>
+                <w:sz w:val="22"/>
+              </w:rPr>
+              <w:t>0.0859 (ns)</w:t>
+            </w:r>
+          </w:p>
+        </w:tc>
+        <w:tc>
+          <w:tcPr>
+            <w:tcW w:type="dxa" w:w="1183"/>
+          </w:tcPr>
+          <w:p>
+            <w:pPr>
+              <w:jc w:val="center"/>
+            </w:pPr>
+            <w:r>
+              <w:rPr>
+                <w:rFonts w:ascii="Times New Roman" w:hAnsi="Times New Roman" w:eastAsia="Times New Roman"/>
+                <w:color w:val="000000"/>
+                <w:sz w:val="22"/>
+              </w:rPr>
+              <w:t>0.1708 (ns)</w:t>
+            </w:r>
+          </w:p>
+        </w:tc>
+        <w:tc>
+          <w:tcPr>
+            <w:tcW w:type="dxa" w:w="1183"/>
+          </w:tcPr>
+          <w:p>
+            <w:pPr>
+              <w:jc w:val="center"/>
+            </w:pPr>
+            <w:r>
+              <w:rPr>
+                <w:rFonts w:ascii="Times New Roman" w:hAnsi="Times New Roman" w:eastAsia="Times New Roman"/>
+                <w:color w:val="000000"/>
+                <w:sz w:val="22"/>
+              </w:rPr>
+              <w:t>0.8685 (ns)</w:t>
+            </w:r>
+          </w:p>
+        </w:tc>
+        <w:tc>
+          <w:tcPr>
+            <w:tcW w:type="dxa" w:w="1183"/>
+          </w:tcPr>
+          <w:p>
+            <w:pPr>
+              <w:jc w:val="center"/>
+            </w:pPr>
+            <w:r>
+              <w:rPr>
+                <w:rFonts w:ascii="Times New Roman" w:hAnsi="Times New Roman" w:eastAsia="Times New Roman"/>
+                <w:color w:val="000000"/>
+                <w:sz w:val="22"/>
+              </w:rPr>
+              <w:t>0.9805 (ns)</w:t>
+            </w:r>
+          </w:p>
+        </w:tc>
+      </w:tr>
+      <w:tr>
+        <w:tc>
+          <w:tcPr>
+            <w:tcW w:type="dxa" w:w="1183"/>
+          </w:tcPr>
+          <w:p>
+            <w:pPr>
+              <w:jc w:val="center"/>
+            </w:pPr>
+            <w:r>
+              <w:rPr>
+                <w:rFonts w:ascii="Times New Roman" w:hAnsi="Times New Roman" w:eastAsia="Times New Roman"/>
+                <w:b/>
+                <w:color w:val="000000"/>
+                <w:sz w:val="22"/>
+              </w:rPr>
+              <w:t>p-value (IB vs MC)</w:t>
+            </w:r>
+          </w:p>
+        </w:tc>
+        <w:tc>
+          <w:tcPr>
+            <w:tcW w:type="dxa" w:w="1183"/>
+          </w:tcPr>
+          <w:p>
+            <w:pPr>
+              <w:jc w:val="center"/>
+            </w:pPr>
+            <w:r>
+              <w:rPr>
+                <w:rFonts w:ascii="Times New Roman" w:hAnsi="Times New Roman" w:eastAsia="Times New Roman"/>
+                <w:color w:val="000000"/>
+                <w:sz w:val="22"/>
+              </w:rPr>
+              <w:t>0.7662 (ns)</w:t>
+            </w:r>
+          </w:p>
+        </w:tc>
+        <w:tc>
+          <w:tcPr>
+            <w:tcW w:type="dxa" w:w="1183"/>
+          </w:tcPr>
+          <w:p>
+            <w:pPr>
+              <w:jc w:val="center"/>
+            </w:pPr>
+            <w:r>
+              <w:rPr>
+                <w:rFonts w:ascii="Times New Roman" w:hAnsi="Times New Roman" w:eastAsia="Times New Roman"/>
+                <w:color w:val="000000"/>
+                <w:sz w:val="22"/>
+              </w:rPr>
+              <w:t>0.9846 (ns)</w:t>
+            </w:r>
+          </w:p>
+        </w:tc>
+        <w:tc>
+          <w:tcPr>
+            <w:tcW w:type="dxa" w:w="1183"/>
+          </w:tcPr>
+          <w:p>
+            <w:pPr>
+              <w:jc w:val="center"/>
+            </w:pPr>
+            <w:r>
+              <w:rPr>
+                <w:rFonts w:ascii="Times New Roman" w:hAnsi="Times New Roman" w:eastAsia="Times New Roman"/>
+                <w:color w:val="000000"/>
+                <w:sz w:val="22"/>
+              </w:rPr>
+              <w:t>0.9969 (ns)</w:t>
+            </w:r>
+          </w:p>
+        </w:tc>
+        <w:tc>
+          <w:tcPr>
+            <w:tcW w:type="dxa" w:w="1183"/>
+          </w:tcPr>
+          <w:p>
+            <w:pPr>
+              <w:jc w:val="center"/>
+            </w:pPr>
+            <w:r>
+              <w:rPr>
+                <w:rFonts w:ascii="Times New Roman" w:hAnsi="Times New Roman" w:eastAsia="Times New Roman"/>
+                <w:color w:val="000000"/>
+                <w:sz w:val="22"/>
+              </w:rPr>
+              <w:t>0.9365 (ns)</w:t>
+            </w:r>
+          </w:p>
+        </w:tc>
+        <w:tc>
+          <w:tcPr>
+            <w:tcW w:type="dxa" w:w="1183"/>
+          </w:tcPr>
+          <w:p>
+            <w:pPr>
+              <w:jc w:val="center"/>
+            </w:pPr>
+            <w:r>
+              <w:rPr>
+                <w:rFonts w:ascii="Times New Roman" w:hAnsi="Times New Roman" w:eastAsia="Times New Roman"/>
+                <w:color w:val="000000"/>
+                <w:sz w:val="22"/>
+              </w:rPr>
+              <w:t>0.9809 (ns)</w:t>
+            </w:r>
+          </w:p>
+        </w:tc>
+        <w:tc>
+          <w:tcPr>
+            <w:tcW w:type="dxa" w:w="1183"/>
+          </w:tcPr>
+          <w:p>
+            <w:pPr>
+              <w:jc w:val="center"/>
+            </w:pPr>
+            <w:r>
+              <w:rPr>
+                <w:rFonts w:ascii="Times New Roman" w:hAnsi="Times New Roman" w:eastAsia="Times New Roman"/>
+                <w:color w:val="000000"/>
+                <w:sz w:val="22"/>
+              </w:rPr>
+              <w:t>0.2153 (ns)</w:t>
+            </w:r>
+          </w:p>
+        </w:tc>
+        <w:tc>
+          <w:tcPr>
+            <w:tcW w:type="dxa" w:w="1183"/>
+          </w:tcPr>
+          <w:p>
+            <w:pPr>
+              <w:jc w:val="center"/>
+            </w:pPr>
+            <w:r>
+              <w:rPr>
+                <w:rFonts w:ascii="Times New Roman" w:hAnsi="Times New Roman" w:eastAsia="Times New Roman"/>
+                <w:color w:val="000000"/>
+                <w:sz w:val="22"/>
+              </w:rPr>
+              <w:t>0.4205 (ns)</w:t>
+            </w:r>
+          </w:p>
+        </w:tc>
+      </w:tr>
+      <w:tr>
+        <w:tc>
+          <w:tcPr>
+            <w:tcW w:type="dxa" w:w="1183"/>
+          </w:tcPr>
+          <w:p>
+            <w:pPr>
+              <w:jc w:val="center"/>
+            </w:pPr>
+            <w:r>
+              <w:rPr>
+                <w:rFonts w:ascii="Times New Roman" w:hAnsi="Times New Roman" w:eastAsia="Times New Roman"/>
+                <w:b/>
+                <w:color w:val="000000"/>
+                <w:sz w:val="22"/>
+              </w:rPr>
+              <w:t>p-value (CL vs IB)</w:t>
+            </w:r>
+          </w:p>
+        </w:tc>
+        <w:tc>
+          <w:tcPr>
+            <w:tcW w:type="dxa" w:w="1183"/>
+          </w:tcPr>
+          <w:p>
+            <w:pPr>
+              <w:jc w:val="center"/>
+            </w:pPr>
+            <w:r>
+              <w:rPr>
+                <w:rFonts w:ascii="Times New Roman" w:hAnsi="Times New Roman" w:eastAsia="Times New Roman"/>
+                <w:color w:val="000000"/>
+                <w:sz w:val="22"/>
+              </w:rPr>
+              <w:t>0.9989 (ns)</w:t>
+            </w:r>
+          </w:p>
+        </w:tc>
+        <w:tc>
+          <w:tcPr>
+            <w:tcW w:type="dxa" w:w="1183"/>
+          </w:tcPr>
+          <w:p>
+            <w:pPr>
+              <w:jc w:val="center"/>
+            </w:pPr>
+            <w:r>
+              <w:rPr>
+                <w:rFonts w:ascii="Times New Roman" w:hAnsi="Times New Roman" w:eastAsia="Times New Roman"/>
+                <w:color w:val="000000"/>
+                <w:sz w:val="22"/>
+              </w:rPr>
+              <w:t>0.4552 (ns)</w:t>
+            </w:r>
+          </w:p>
+        </w:tc>
+        <w:tc>
+          <w:tcPr>
+            <w:tcW w:type="dxa" w:w="1183"/>
+          </w:tcPr>
+          <w:p>
+            <w:pPr>
+              <w:jc w:val="center"/>
+            </w:pPr>
+            <w:r>
+              <w:rPr>
+                <w:rFonts w:ascii="Times New Roman" w:hAnsi="Times New Roman" w:eastAsia="Times New Roman"/>
+                <w:color w:val="000000"/>
+                <w:sz w:val="22"/>
+              </w:rPr>
+              <w:t>0.6778 (ns)</w:t>
+            </w:r>
+          </w:p>
+        </w:tc>
+        <w:tc>
+          <w:tcPr>
+            <w:tcW w:type="dxa" w:w="1183"/>
+          </w:tcPr>
+          <w:p>
+            <w:pPr>
+              <w:jc w:val="center"/>
+            </w:pPr>
+            <w:r>
+              <w:rPr>
+                <w:rFonts w:ascii="Times New Roman" w:hAnsi="Times New Roman" w:eastAsia="Times New Roman"/>
+                <w:color w:val="000000"/>
+                <w:sz w:val="22"/>
+              </w:rPr>
+              <w:t>0.4010 (ns)</w:t>
+            </w:r>
+          </w:p>
+        </w:tc>
+        <w:tc>
+          <w:tcPr>
+            <w:tcW w:type="dxa" w:w="1183"/>
+          </w:tcPr>
+          <w:p>
+            <w:pPr>
+              <w:jc w:val="center"/>
+            </w:pPr>
+            <w:r>
+              <w:rPr>
+                <w:rFonts w:ascii="Times New Roman" w:hAnsi="Times New Roman" w:eastAsia="Times New Roman"/>
+                <w:color w:val="000000"/>
+                <w:sz w:val="22"/>
+              </w:rPr>
+              <w:t>0.1013 (ns)</w:t>
+            </w:r>
+          </w:p>
+        </w:tc>
+        <w:tc>
+          <w:tcPr>
+            <w:tcW w:type="dxa" w:w="1183"/>
+          </w:tcPr>
+          <w:p>
+            <w:pPr>
+              <w:jc w:val="center"/>
+            </w:pPr>
+            <w:r>
+              <w:rPr>
+                <w:rFonts w:ascii="Times New Roman" w:hAnsi="Times New Roman" w:eastAsia="Times New Roman"/>
+                <w:color w:val="000000"/>
+                <w:sz w:val="22"/>
+              </w:rPr>
+              <w:t>0.3555 (ns)</w:t>
+            </w:r>
+          </w:p>
+        </w:tc>
+        <w:tc>
+          <w:tcPr>
+            <w:tcW w:type="dxa" w:w="1183"/>
+          </w:tcPr>
+          <w:p>
+            <w:pPr>
+              <w:jc w:val="center"/>
+            </w:pPr>
+            <w:r>
+              <w:rPr>
+                <w:rFonts w:ascii="Times New Roman" w:hAnsi="Times New Roman" w:eastAsia="Times New Roman"/>
+                <w:color w:val="000000"/>
+                <w:sz w:val="22"/>
+              </w:rPr>
+              <w:t>0.1489 (ns)</w:t>
+            </w:r>
+          </w:p>
+        </w:tc>
+      </w:tr>
     </w:tbl>
     <w:p>
       <w:pPr>
@@ -860,7 +1448,7 @@
           <w:color w:val="000000"/>
           <w:sz w:val="24"/>
         </w:rPr>
-        <w:t>Table 3.2 summarizes the group means and standard errors for the parameters measured during the Bay Leaf assay.</w:t>
+        <w:t>Table 3.2 summarizes the group means, standard errors, and Tukey-adjusted comparison p-values for the parameters measured during the Bay Leaf assay.</w:t>
       </w:r>
     </w:p>
     <w:p>
@@ -874,7 +1462,7 @@
           <w:color w:val="000000"/>
           <w:sz w:val="24"/>
         </w:rPr>
-        <w:t>Table 3.2: Group Means and Standard Errors (Bay Leaf Assay)</w:t>
+        <w:t>Table 3.2: Group Means, Standard Errors, and Pairwise Tukey p-values (Bay Leaf Assay)</w:t>
       </w:r>
     </w:p>
     <w:tbl>
@@ -920,7 +1508,7 @@
                 <w:color w:val="000000"/>
                 <w:sz w:val="22"/>
               </w:rPr>
-              <w:t>Group</w:t>
+              <w:t>Group / Comparison</w:t>
             </w:r>
           </w:p>
         </w:tc>
@@ -1095,7 +1683,7 @@
                 <w:color w:val="000000"/>
                 <w:sz w:val="22"/>
               </w:rPr>
-              <w:t>NG</w:t>
+              <w:t>NG (Normal Control)</w:t>
             </w:r>
           </w:p>
         </w:tc>
@@ -1242,7 +1830,7 @@
                 <w:color w:val="000000"/>
                 <w:sz w:val="22"/>
               </w:rPr>
-              <w:t>MG</w:t>
+              <w:t>MG (Model Control)</w:t>
             </w:r>
           </w:p>
         </w:tc>
@@ -1389,7 +1977,7 @@
                 <w:color w:val="000000"/>
                 <w:sz w:val="22"/>
               </w:rPr>
-              <w:t>BL</w:t>
+              <w:t>BL (Bay Leaf Extract)</w:t>
             </w:r>
           </w:p>
         </w:tc>
@@ -1536,7 +2124,7 @@
                 <w:color w:val="000000"/>
                 <w:sz w:val="22"/>
               </w:rPr>
-              <w:t>IBU</w:t>
+              <w:t>IBU (Ibuprofen)</w:t>
             </w:r>
           </w:p>
         </w:tc>
@@ -1683,7 +2271,7 @@
                 <w:color w:val="000000"/>
                 <w:sz w:val="22"/>
               </w:rPr>
-              <w:t>CL</w:t>
+              <w:t>CL (Clove Extract)</w:t>
             </w:r>
           </w:p>
         </w:tc>
@@ -1814,6 +2402,888 @@
           </w:p>
         </w:tc>
       </w:tr>
+      <w:tr>
+        <w:tc>
+          <w:tcPr>
+            <w:tcW w:type="dxa" w:w="1183"/>
+          </w:tcPr>
+          <w:p>
+            <w:pPr>
+              <w:jc w:val="center"/>
+            </w:pPr>
+            <w:r>
+              <w:rPr>
+                <w:rFonts w:ascii="Times New Roman" w:hAnsi="Times New Roman" w:eastAsia="Times New Roman"/>
+                <w:b/>
+                <w:color w:val="000000"/>
+                <w:sz w:val="22"/>
+              </w:rPr>
+              <w:t>p-value (MG vs NG)</w:t>
+            </w:r>
+          </w:p>
+        </w:tc>
+        <w:tc>
+          <w:tcPr>
+            <w:tcW w:type="dxa" w:w="1183"/>
+          </w:tcPr>
+          <w:p>
+            <w:pPr>
+              <w:jc w:val="center"/>
+            </w:pPr>
+            <w:r>
+              <w:rPr>
+                <w:rFonts w:ascii="Times New Roman" w:hAnsi="Times New Roman" w:eastAsia="Times New Roman"/>
+                <w:color w:val="000000"/>
+                <w:sz w:val="22"/>
+              </w:rPr>
+              <w:t>0.9971 (ns)</w:t>
+            </w:r>
+          </w:p>
+        </w:tc>
+        <w:tc>
+          <w:tcPr>
+            <w:tcW w:type="dxa" w:w="1183"/>
+          </w:tcPr>
+          <w:p>
+            <w:pPr>
+              <w:jc w:val="center"/>
+            </w:pPr>
+            <w:r>
+              <w:rPr>
+                <w:rFonts w:ascii="Times New Roman" w:hAnsi="Times New Roman" w:eastAsia="Times New Roman"/>
+                <w:color w:val="000000"/>
+                <w:sz w:val="22"/>
+              </w:rPr>
+              <w:t>0.9979 (ns)</w:t>
+            </w:r>
+          </w:p>
+        </w:tc>
+        <w:tc>
+          <w:tcPr>
+            <w:tcW w:type="dxa" w:w="1183"/>
+          </w:tcPr>
+          <w:p>
+            <w:pPr>
+              <w:jc w:val="center"/>
+            </w:pPr>
+            <w:r>
+              <w:rPr>
+                <w:rFonts w:ascii="Times New Roman" w:hAnsi="Times New Roman" w:eastAsia="Times New Roman"/>
+                <w:color w:val="000000"/>
+                <w:sz w:val="22"/>
+              </w:rPr>
+              <w:t>0.9165 (ns)</w:t>
+            </w:r>
+          </w:p>
+        </w:tc>
+        <w:tc>
+          <w:tcPr>
+            <w:tcW w:type="dxa" w:w="1183"/>
+          </w:tcPr>
+          <w:p>
+            <w:pPr>
+              <w:jc w:val="center"/>
+            </w:pPr>
+            <w:r>
+              <w:rPr>
+                <w:rFonts w:ascii="Times New Roman" w:hAnsi="Times New Roman" w:eastAsia="Times New Roman"/>
+                <w:color w:val="000000"/>
+                <w:sz w:val="22"/>
+              </w:rPr>
+              <w:t>0.9957 (ns)</w:t>
+            </w:r>
+          </w:p>
+        </w:tc>
+        <w:tc>
+          <w:tcPr>
+            <w:tcW w:type="dxa" w:w="1183"/>
+          </w:tcPr>
+          <w:p>
+            <w:pPr>
+              <w:jc w:val="center"/>
+            </w:pPr>
+            <w:r>
+              <w:rPr>
+                <w:rFonts w:ascii="Times New Roman" w:hAnsi="Times New Roman" w:eastAsia="Times New Roman"/>
+                <w:color w:val="000000"/>
+                <w:sz w:val="22"/>
+              </w:rPr>
+              <w:t>1.0000 (ns)</w:t>
+            </w:r>
+          </w:p>
+        </w:tc>
+        <w:tc>
+          <w:tcPr>
+            <w:tcW w:type="dxa" w:w="1183"/>
+          </w:tcPr>
+          <w:p>
+            <w:pPr>
+              <w:jc w:val="center"/>
+            </w:pPr>
+            <w:r>
+              <w:rPr>
+                <w:rFonts w:ascii="Times New Roman" w:hAnsi="Times New Roman" w:eastAsia="Times New Roman"/>
+                <w:color w:val="000000"/>
+                <w:sz w:val="22"/>
+              </w:rPr>
+              <w:t>0.9998 (ns)</w:t>
+            </w:r>
+          </w:p>
+        </w:tc>
+        <w:tc>
+          <w:tcPr>
+            <w:tcW w:type="dxa" w:w="1183"/>
+          </w:tcPr>
+          <w:p>
+            <w:pPr>
+              <w:jc w:val="center"/>
+            </w:pPr>
+            <w:r>
+              <w:rPr>
+                <w:rFonts w:ascii="Times New Roman" w:hAnsi="Times New Roman" w:eastAsia="Times New Roman"/>
+                <w:color w:val="000000"/>
+                <w:sz w:val="22"/>
+              </w:rPr>
+              <w:t>0.9873 (ns)</w:t>
+            </w:r>
+          </w:p>
+        </w:tc>
+      </w:tr>
+      <w:tr>
+        <w:tc>
+          <w:tcPr>
+            <w:tcW w:type="dxa" w:w="1183"/>
+          </w:tcPr>
+          <w:p>
+            <w:pPr>
+              <w:jc w:val="center"/>
+            </w:pPr>
+            <w:r>
+              <w:rPr>
+                <w:rFonts w:ascii="Times New Roman" w:hAnsi="Times New Roman" w:eastAsia="Times New Roman"/>
+                <w:b/>
+                <w:color w:val="000000"/>
+                <w:sz w:val="22"/>
+              </w:rPr>
+              <w:t>p-value (BL vs MG)</w:t>
+            </w:r>
+          </w:p>
+        </w:tc>
+        <w:tc>
+          <w:tcPr>
+            <w:tcW w:type="dxa" w:w="1183"/>
+          </w:tcPr>
+          <w:p>
+            <w:pPr>
+              <w:jc w:val="center"/>
+            </w:pPr>
+            <w:r>
+              <w:rPr>
+                <w:rFonts w:ascii="Times New Roman" w:hAnsi="Times New Roman" w:eastAsia="Times New Roman"/>
+                <w:color w:val="000000"/>
+                <w:sz w:val="22"/>
+              </w:rPr>
+              <w:t>0.7548 (ns)</w:t>
+            </w:r>
+          </w:p>
+        </w:tc>
+        <w:tc>
+          <w:tcPr>
+            <w:tcW w:type="dxa" w:w="1183"/>
+          </w:tcPr>
+          <w:p>
+            <w:pPr>
+              <w:jc w:val="center"/>
+            </w:pPr>
+            <w:r>
+              <w:rPr>
+                <w:rFonts w:ascii="Times New Roman" w:hAnsi="Times New Roman" w:eastAsia="Times New Roman"/>
+                <w:color w:val="000000"/>
+                <w:sz w:val="22"/>
+              </w:rPr>
+              <w:t>0.9243 (ns)</w:t>
+            </w:r>
+          </w:p>
+        </w:tc>
+        <w:tc>
+          <w:tcPr>
+            <w:tcW w:type="dxa" w:w="1183"/>
+          </w:tcPr>
+          <w:p>
+            <w:pPr>
+              <w:jc w:val="center"/>
+            </w:pPr>
+            <w:r>
+              <w:rPr>
+                <w:rFonts w:ascii="Times New Roman" w:hAnsi="Times New Roman" w:eastAsia="Times New Roman"/>
+                <w:color w:val="000000"/>
+                <w:sz w:val="22"/>
+              </w:rPr>
+              <w:t>0.9043 (ns)</w:t>
+            </w:r>
+          </w:p>
+        </w:tc>
+        <w:tc>
+          <w:tcPr>
+            <w:tcW w:type="dxa" w:w="1183"/>
+          </w:tcPr>
+          <w:p>
+            <w:pPr>
+              <w:jc w:val="center"/>
+            </w:pPr>
+            <w:r>
+              <w:rPr>
+                <w:rFonts w:ascii="Times New Roman" w:hAnsi="Times New Roman" w:eastAsia="Times New Roman"/>
+                <w:color w:val="000000"/>
+                <w:sz w:val="22"/>
+              </w:rPr>
+              <w:t>0.3864 (ns)</w:t>
+            </w:r>
+          </w:p>
+        </w:tc>
+        <w:tc>
+          <w:tcPr>
+            <w:tcW w:type="dxa" w:w="1183"/>
+          </w:tcPr>
+          <w:p>
+            <w:pPr>
+              <w:jc w:val="center"/>
+            </w:pPr>
+            <w:r>
+              <w:rPr>
+                <w:rFonts w:ascii="Times New Roman" w:hAnsi="Times New Roman" w:eastAsia="Times New Roman"/>
+                <w:color w:val="000000"/>
+                <w:sz w:val="22"/>
+              </w:rPr>
+              <w:t>0.6683 (ns)</w:t>
+            </w:r>
+          </w:p>
+        </w:tc>
+        <w:tc>
+          <w:tcPr>
+            <w:tcW w:type="dxa" w:w="1183"/>
+          </w:tcPr>
+          <w:p>
+            <w:pPr>
+              <w:jc w:val="center"/>
+            </w:pPr>
+            <w:r>
+              <w:rPr>
+                <w:rFonts w:ascii="Times New Roman" w:hAnsi="Times New Roman" w:eastAsia="Times New Roman"/>
+                <w:color w:val="000000"/>
+                <w:sz w:val="22"/>
+              </w:rPr>
+              <w:t>0.9985 (ns)</w:t>
+            </w:r>
+          </w:p>
+        </w:tc>
+        <w:tc>
+          <w:tcPr>
+            <w:tcW w:type="dxa" w:w="1183"/>
+          </w:tcPr>
+          <w:p>
+            <w:pPr>
+              <w:jc w:val="center"/>
+            </w:pPr>
+            <w:r>
+              <w:rPr>
+                <w:rFonts w:ascii="Times New Roman" w:hAnsi="Times New Roman" w:eastAsia="Times New Roman"/>
+                <w:color w:val="000000"/>
+                <w:sz w:val="22"/>
+              </w:rPr>
+              <w:t>0.9986 (ns)</w:t>
+            </w:r>
+          </w:p>
+        </w:tc>
+      </w:tr>
+      <w:tr>
+        <w:tc>
+          <w:tcPr>
+            <w:tcW w:type="dxa" w:w="1183"/>
+          </w:tcPr>
+          <w:p>
+            <w:pPr>
+              <w:jc w:val="center"/>
+            </w:pPr>
+            <w:r>
+              <w:rPr>
+                <w:rFonts w:ascii="Times New Roman" w:hAnsi="Times New Roman" w:eastAsia="Times New Roman"/>
+                <w:b/>
+                <w:color w:val="000000"/>
+                <w:sz w:val="22"/>
+              </w:rPr>
+              <w:t>p-value (IBU vs MG)</w:t>
+            </w:r>
+          </w:p>
+        </w:tc>
+        <w:tc>
+          <w:tcPr>
+            <w:tcW w:type="dxa" w:w="1183"/>
+          </w:tcPr>
+          <w:p>
+            <w:pPr>
+              <w:jc w:val="center"/>
+            </w:pPr>
+            <w:r>
+              <w:rPr>
+                <w:rFonts w:ascii="Times New Roman" w:hAnsi="Times New Roman" w:eastAsia="Times New Roman"/>
+                <w:color w:val="000000"/>
+                <w:sz w:val="22"/>
+              </w:rPr>
+              <w:t>0.9955 (ns)</w:t>
+            </w:r>
+          </w:p>
+        </w:tc>
+        <w:tc>
+          <w:tcPr>
+            <w:tcW w:type="dxa" w:w="1183"/>
+          </w:tcPr>
+          <w:p>
+            <w:pPr>
+              <w:jc w:val="center"/>
+            </w:pPr>
+            <w:r>
+              <w:rPr>
+                <w:rFonts w:ascii="Times New Roman" w:hAnsi="Times New Roman" w:eastAsia="Times New Roman"/>
+                <w:color w:val="000000"/>
+                <w:sz w:val="22"/>
+              </w:rPr>
+              <w:t>0.9993 (ns)</w:t>
+            </w:r>
+          </w:p>
+        </w:tc>
+        <w:tc>
+          <w:tcPr>
+            <w:tcW w:type="dxa" w:w="1183"/>
+          </w:tcPr>
+          <w:p>
+            <w:pPr>
+              <w:jc w:val="center"/>
+            </w:pPr>
+            <w:r>
+              <w:rPr>
+                <w:rFonts w:ascii="Times New Roman" w:hAnsi="Times New Roman" w:eastAsia="Times New Roman"/>
+                <w:color w:val="000000"/>
+                <w:sz w:val="22"/>
+              </w:rPr>
+              <w:t>0.8153 (ns)</w:t>
+            </w:r>
+          </w:p>
+        </w:tc>
+        <w:tc>
+          <w:tcPr>
+            <w:tcW w:type="dxa" w:w="1183"/>
+          </w:tcPr>
+          <w:p>
+            <w:pPr>
+              <w:jc w:val="center"/>
+            </w:pPr>
+            <w:r>
+              <w:rPr>
+                <w:rFonts w:ascii="Times New Roman" w:hAnsi="Times New Roman" w:eastAsia="Times New Roman"/>
+                <w:color w:val="000000"/>
+                <w:sz w:val="22"/>
+              </w:rPr>
+              <w:t>0.6660 (ns)</w:t>
+            </w:r>
+          </w:p>
+        </w:tc>
+        <w:tc>
+          <w:tcPr>
+            <w:tcW w:type="dxa" w:w="1183"/>
+          </w:tcPr>
+          <w:p>
+            <w:pPr>
+              <w:jc w:val="center"/>
+            </w:pPr>
+            <w:r>
+              <w:rPr>
+                <w:rFonts w:ascii="Times New Roman" w:hAnsi="Times New Roman" w:eastAsia="Times New Roman"/>
+                <w:color w:val="000000"/>
+                <w:sz w:val="22"/>
+              </w:rPr>
+              <w:t>0.9676 (ns)</w:t>
+            </w:r>
+          </w:p>
+        </w:tc>
+        <w:tc>
+          <w:tcPr>
+            <w:tcW w:type="dxa" w:w="1183"/>
+          </w:tcPr>
+          <w:p>
+            <w:pPr>
+              <w:jc w:val="center"/>
+            </w:pPr>
+            <w:r>
+              <w:rPr>
+                <w:rFonts w:ascii="Times New Roman" w:hAnsi="Times New Roman" w:eastAsia="Times New Roman"/>
+                <w:color w:val="000000"/>
+                <w:sz w:val="22"/>
+              </w:rPr>
+              <w:t>1.0000 (ns)</w:t>
+            </w:r>
+          </w:p>
+        </w:tc>
+        <w:tc>
+          <w:tcPr>
+            <w:tcW w:type="dxa" w:w="1183"/>
+          </w:tcPr>
+          <w:p>
+            <w:pPr>
+              <w:jc w:val="center"/>
+            </w:pPr>
+            <w:r>
+              <w:rPr>
+                <w:rFonts w:ascii="Times New Roman" w:hAnsi="Times New Roman" w:eastAsia="Times New Roman"/>
+                <w:color w:val="000000"/>
+                <w:sz w:val="22"/>
+              </w:rPr>
+              <w:t>0.9999 (ns)</w:t>
+            </w:r>
+          </w:p>
+        </w:tc>
+      </w:tr>
+      <w:tr>
+        <w:tc>
+          <w:tcPr>
+            <w:tcW w:type="dxa" w:w="1183"/>
+          </w:tcPr>
+          <w:p>
+            <w:pPr>
+              <w:jc w:val="center"/>
+            </w:pPr>
+            <w:r>
+              <w:rPr>
+                <w:rFonts w:ascii="Times New Roman" w:hAnsi="Times New Roman" w:eastAsia="Times New Roman"/>
+                <w:b/>
+                <w:color w:val="000000"/>
+                <w:sz w:val="22"/>
+              </w:rPr>
+              <w:t>p-value (CL vs MG)</w:t>
+            </w:r>
+          </w:p>
+        </w:tc>
+        <w:tc>
+          <w:tcPr>
+            <w:tcW w:type="dxa" w:w="1183"/>
+          </w:tcPr>
+          <w:p>
+            <w:pPr>
+              <w:jc w:val="center"/>
+            </w:pPr>
+            <w:r>
+              <w:rPr>
+                <w:rFonts w:ascii="Times New Roman" w:hAnsi="Times New Roman" w:eastAsia="Times New Roman"/>
+                <w:color w:val="000000"/>
+                <w:sz w:val="22"/>
+              </w:rPr>
+              <w:t>0.9186 (ns)</w:t>
+            </w:r>
+          </w:p>
+        </w:tc>
+        <w:tc>
+          <w:tcPr>
+            <w:tcW w:type="dxa" w:w="1183"/>
+          </w:tcPr>
+          <w:p>
+            <w:pPr>
+              <w:jc w:val="center"/>
+            </w:pPr>
+            <w:r>
+              <w:rPr>
+                <w:rFonts w:ascii="Times New Roman" w:hAnsi="Times New Roman" w:eastAsia="Times New Roman"/>
+                <w:color w:val="000000"/>
+                <w:sz w:val="22"/>
+              </w:rPr>
+              <w:t>0.9308 (ns)</w:t>
+            </w:r>
+          </w:p>
+        </w:tc>
+        <w:tc>
+          <w:tcPr>
+            <w:tcW w:type="dxa" w:w="1183"/>
+          </w:tcPr>
+          <w:p>
+            <w:pPr>
+              <w:jc w:val="center"/>
+            </w:pPr>
+            <w:r>
+              <w:rPr>
+                <w:rFonts w:ascii="Times New Roman" w:hAnsi="Times New Roman" w:eastAsia="Times New Roman"/>
+                <w:color w:val="000000"/>
+                <w:sz w:val="22"/>
+              </w:rPr>
+              <w:t>0.9511 (ns)</w:t>
+            </w:r>
+          </w:p>
+        </w:tc>
+        <w:tc>
+          <w:tcPr>
+            <w:tcW w:type="dxa" w:w="1183"/>
+          </w:tcPr>
+          <w:p>
+            <w:pPr>
+              <w:jc w:val="center"/>
+            </w:pPr>
+            <w:r>
+              <w:rPr>
+                <w:rFonts w:ascii="Times New Roman" w:hAnsi="Times New Roman" w:eastAsia="Times New Roman"/>
+                <w:color w:val="000000"/>
+                <w:sz w:val="22"/>
+              </w:rPr>
+              <w:t>0.5611 (ns)</w:t>
+            </w:r>
+          </w:p>
+        </w:tc>
+        <w:tc>
+          <w:tcPr>
+            <w:tcW w:type="dxa" w:w="1183"/>
+          </w:tcPr>
+          <w:p>
+            <w:pPr>
+              <w:jc w:val="center"/>
+            </w:pPr>
+            <w:r>
+              <w:rPr>
+                <w:rFonts w:ascii="Times New Roman" w:hAnsi="Times New Roman" w:eastAsia="Times New Roman"/>
+                <w:color w:val="000000"/>
+                <w:sz w:val="22"/>
+              </w:rPr>
+              <w:t>0.9998 (ns)</w:t>
+            </w:r>
+          </w:p>
+        </w:tc>
+        <w:tc>
+          <w:tcPr>
+            <w:tcW w:type="dxa" w:w="1183"/>
+          </w:tcPr>
+          <w:p>
+            <w:pPr>
+              <w:jc w:val="center"/>
+            </w:pPr>
+            <w:r>
+              <w:rPr>
+                <w:rFonts w:ascii="Times New Roman" w:hAnsi="Times New Roman" w:eastAsia="Times New Roman"/>
+                <w:color w:val="000000"/>
+                <w:sz w:val="22"/>
+              </w:rPr>
+              <w:t>1.0000 (ns)</w:t>
+            </w:r>
+          </w:p>
+        </w:tc>
+        <w:tc>
+          <w:tcPr>
+            <w:tcW w:type="dxa" w:w="1183"/>
+          </w:tcPr>
+          <w:p>
+            <w:pPr>
+              <w:jc w:val="center"/>
+            </w:pPr>
+            <w:r>
+              <w:rPr>
+                <w:rFonts w:ascii="Times New Roman" w:hAnsi="Times New Roman" w:eastAsia="Times New Roman"/>
+                <w:color w:val="000000"/>
+                <w:sz w:val="22"/>
+              </w:rPr>
+              <w:t>0.9027 (ns)</w:t>
+            </w:r>
+          </w:p>
+        </w:tc>
+      </w:tr>
+      <w:tr>
+        <w:tc>
+          <w:tcPr>
+            <w:tcW w:type="dxa" w:w="1183"/>
+          </w:tcPr>
+          <w:p>
+            <w:pPr>
+              <w:jc w:val="center"/>
+            </w:pPr>
+            <w:r>
+              <w:rPr>
+                <w:rFonts w:ascii="Times New Roman" w:hAnsi="Times New Roman" w:eastAsia="Times New Roman"/>
+                <w:b/>
+                <w:color w:val="000000"/>
+                <w:sz w:val="22"/>
+              </w:rPr>
+              <w:t>p-value (BL vs IBU)</w:t>
+            </w:r>
+          </w:p>
+        </w:tc>
+        <w:tc>
+          <w:tcPr>
+            <w:tcW w:type="dxa" w:w="1183"/>
+          </w:tcPr>
+          <w:p>
+            <w:pPr>
+              <w:jc w:val="center"/>
+            </w:pPr>
+            <w:r>
+              <w:rPr>
+                <w:rFonts w:ascii="Times New Roman" w:hAnsi="Times New Roman" w:eastAsia="Times New Roman"/>
+                <w:color w:val="000000"/>
+                <w:sz w:val="22"/>
+              </w:rPr>
+              <w:t>0.9519 (ns)</w:t>
+            </w:r>
+          </w:p>
+        </w:tc>
+        <w:tc>
+          <w:tcPr>
+            <w:tcW w:type="dxa" w:w="1183"/>
+          </w:tcPr>
+          <w:p>
+            <w:pPr>
+              <w:jc w:val="center"/>
+            </w:pPr>
+            <w:r>
+              <w:rPr>
+                <w:rFonts w:ascii="Times New Roman" w:hAnsi="Times New Roman" w:eastAsia="Times New Roman"/>
+                <w:color w:val="000000"/>
+                <w:sz w:val="22"/>
+              </w:rPr>
+              <w:t>0.9849 (ns)</w:t>
+            </w:r>
+          </w:p>
+        </w:tc>
+        <w:tc>
+          <w:tcPr>
+            <w:tcW w:type="dxa" w:w="1183"/>
+          </w:tcPr>
+          <w:p>
+            <w:pPr>
+              <w:jc w:val="center"/>
+            </w:pPr>
+            <w:r>
+              <w:rPr>
+                <w:rFonts w:ascii="Times New Roman" w:hAnsi="Times New Roman" w:eastAsia="Times New Roman"/>
+                <w:color w:val="000000"/>
+                <w:sz w:val="22"/>
+              </w:rPr>
+              <w:t>0.9842 (ns)</w:t>
+            </w:r>
+          </w:p>
+        </w:tc>
+        <w:tc>
+          <w:tcPr>
+            <w:tcW w:type="dxa" w:w="1183"/>
+          </w:tcPr>
+          <w:p>
+            <w:pPr>
+              <w:jc w:val="center"/>
+            </w:pPr>
+            <w:r>
+              <w:rPr>
+                <w:rFonts w:ascii="Times New Roman" w:hAnsi="Times New Roman" w:eastAsia="Times New Roman"/>
+                <w:color w:val="000000"/>
+                <w:sz w:val="22"/>
+              </w:rPr>
+              <w:t>1.0000 (ns)</w:t>
+            </w:r>
+          </w:p>
+        </w:tc>
+        <w:tc>
+          <w:tcPr>
+            <w:tcW w:type="dxa" w:w="1183"/>
+          </w:tcPr>
+          <w:p>
+            <w:pPr>
+              <w:jc w:val="center"/>
+            </w:pPr>
+            <w:r>
+              <w:rPr>
+                <w:rFonts w:ascii="Times New Roman" w:hAnsi="Times New Roman" w:eastAsia="Times New Roman"/>
+                <w:color w:val="000000"/>
+                <w:sz w:val="22"/>
+              </w:rPr>
+              <w:t>0.9839 (ns)</w:t>
+            </w:r>
+          </w:p>
+        </w:tc>
+        <w:tc>
+          <w:tcPr>
+            <w:tcW w:type="dxa" w:w="1183"/>
+          </w:tcPr>
+          <w:p>
+            <w:pPr>
+              <w:jc w:val="center"/>
+            </w:pPr>
+            <w:r>
+              <w:rPr>
+                <w:rFonts w:ascii="Times New Roman" w:hAnsi="Times New Roman" w:eastAsia="Times New Roman"/>
+                <w:color w:val="000000"/>
+                <w:sz w:val="22"/>
+              </w:rPr>
+              <w:t>0.9980 (ns)</w:t>
+            </w:r>
+          </w:p>
+        </w:tc>
+        <w:tc>
+          <w:tcPr>
+            <w:tcW w:type="dxa" w:w="1183"/>
+          </w:tcPr>
+          <w:p>
+            <w:pPr>
+              <w:jc w:val="center"/>
+            </w:pPr>
+            <w:r>
+              <w:rPr>
+                <w:rFonts w:ascii="Times New Roman" w:hAnsi="Times New Roman" w:eastAsia="Times New Roman"/>
+                <w:color w:val="000000"/>
+                <w:sz w:val="22"/>
+              </w:rPr>
+              <w:t>0.9914 (ns)</w:t>
+            </w:r>
+          </w:p>
+        </w:tc>
+      </w:tr>
+      <w:tr>
+        <w:tc>
+          <w:tcPr>
+            <w:tcW w:type="dxa" w:w="1183"/>
+          </w:tcPr>
+          <w:p>
+            <w:pPr>
+              <w:jc w:val="center"/>
+            </w:pPr>
+            <w:r>
+              <w:rPr>
+                <w:rFonts w:ascii="Times New Roman" w:hAnsi="Times New Roman" w:eastAsia="Times New Roman"/>
+                <w:b/>
+                <w:color w:val="000000"/>
+                <w:sz w:val="22"/>
+              </w:rPr>
+              <w:t>p-value (CL vs IBU)</w:t>
+            </w:r>
+          </w:p>
+        </w:tc>
+        <w:tc>
+          <w:tcPr>
+            <w:tcW w:type="dxa" w:w="1183"/>
+          </w:tcPr>
+          <w:p>
+            <w:pPr>
+              <w:jc w:val="center"/>
+            </w:pPr>
+            <w:r>
+              <w:rPr>
+                <w:rFonts w:ascii="Times New Roman" w:hAnsi="Times New Roman" w:eastAsia="Times New Roman"/>
+                <w:color w:val="000000"/>
+                <w:sz w:val="22"/>
+              </w:rPr>
+              <w:t>0.9871 (ns)</w:t>
+            </w:r>
+          </w:p>
+        </w:tc>
+        <w:tc>
+          <w:tcPr>
+            <w:tcW w:type="dxa" w:w="1183"/>
+          </w:tcPr>
+          <w:p>
+            <w:pPr>
+              <w:jc w:val="center"/>
+            </w:pPr>
+            <w:r>
+              <w:rPr>
+                <w:rFonts w:ascii="Times New Roman" w:hAnsi="Times New Roman" w:eastAsia="Times New Roman"/>
+                <w:color w:val="000000"/>
+                <w:sz w:val="22"/>
+              </w:rPr>
+              <w:t>0.9759 (ns)</w:t>
+            </w:r>
+          </w:p>
+        </w:tc>
+        <w:tc>
+          <w:tcPr>
+            <w:tcW w:type="dxa" w:w="1183"/>
+          </w:tcPr>
+          <w:p>
+            <w:pPr>
+              <w:jc w:val="center"/>
+            </w:pPr>
+            <w:r>
+              <w:rPr>
+                <w:rFonts w:ascii="Times New Roman" w:hAnsi="Times New Roman" w:eastAsia="Times New Roman"/>
+                <w:color w:val="000000"/>
+                <w:sz w:val="22"/>
+              </w:rPr>
+              <w:t>0.9990 (ns)</w:t>
+            </w:r>
+          </w:p>
+        </w:tc>
+        <w:tc>
+          <w:tcPr>
+            <w:tcW w:type="dxa" w:w="1183"/>
+          </w:tcPr>
+          <w:p>
+            <w:pPr>
+              <w:jc w:val="center"/>
+            </w:pPr>
+            <w:r>
+              <w:rPr>
+                <w:rFonts w:ascii="Times New Roman" w:hAnsi="Times New Roman" w:eastAsia="Times New Roman"/>
+                <w:color w:val="000000"/>
+                <w:sz w:val="22"/>
+              </w:rPr>
+              <w:t>0.9977 (ns)</w:t>
+            </w:r>
+          </w:p>
+        </w:tc>
+        <w:tc>
+          <w:tcPr>
+            <w:tcW w:type="dxa" w:w="1183"/>
+          </w:tcPr>
+          <w:p>
+            <w:pPr>
+              <w:jc w:val="center"/>
+            </w:pPr>
+            <w:r>
+              <w:rPr>
+                <w:rFonts w:ascii="Times New Roman" w:hAnsi="Times New Roman" w:eastAsia="Times New Roman"/>
+                <w:color w:val="000000"/>
+                <w:sz w:val="22"/>
+              </w:rPr>
+              <w:t>0.9947 (ns)</w:t>
+            </w:r>
+          </w:p>
+        </w:tc>
+        <w:tc>
+          <w:tcPr>
+            <w:tcW w:type="dxa" w:w="1183"/>
+          </w:tcPr>
+          <w:p>
+            <w:pPr>
+              <w:jc w:val="center"/>
+            </w:pPr>
+            <w:r>
+              <w:rPr>
+                <w:rFonts w:ascii="Times New Roman" w:hAnsi="Times New Roman" w:eastAsia="Times New Roman"/>
+                <w:color w:val="000000"/>
+                <w:sz w:val="22"/>
+              </w:rPr>
+              <w:t>1.0000 (ns)</w:t>
+            </w:r>
+          </w:p>
+        </w:tc>
+        <w:tc>
+          <w:tcPr>
+            <w:tcW w:type="dxa" w:w="1183"/>
+          </w:tcPr>
+          <w:p>
+            <w:pPr>
+              <w:jc w:val="center"/>
+            </w:pPr>
+            <w:r>
+              <w:rPr>
+                <w:rFonts w:ascii="Times New Roman" w:hAnsi="Times New Roman" w:eastAsia="Times New Roman"/>
+                <w:color w:val="000000"/>
+                <w:sz w:val="22"/>
+              </w:rPr>
+              <w:t>0.8568 (ns)</w:t>
+            </w:r>
+          </w:p>
+        </w:tc>
+      </w:tr>
     </w:tbl>
     <w:p>
       <w:pPr>
@@ -1923,7 +3393,7 @@
           <w:color w:val="000000"/>
           <w:sz w:val="24"/>
         </w:rPr>
-        <w:t>Clove assay mean values are presented in the multi-panel bar chart above. In the healthy control group, antioxidant enzyme activities are maintained at physiological levels. Spasmogen administration causes a drop in superoxide dismutase activity from 1.6934 U/g Prot in the normal control to 1.3108 U/g Prot in the model control. Catalase activity similarly falls from 1.2774 U/g Prot to 0.9805 U/g Prot. This represents the depletion of the primary enzymatic defense lines due to free radical generation.</w:t>
+        <w:t>Clove assay mean values are presented in the multi-panel bar chart above. In the healthy control group, antioxidant enzyme activities are maintained at physiological levels. Spasmogen administration causes a drop in superoxide dismutase activity from 1.6934 U/g Prot in the normal control to 1.3108 U/g Prot in the model control. This drop in SOD is statistically significant (Tukey p = 0.0374). Catalase activity similarly falls from 1.2774 U/g Prot in the normal control to 0.9805 U/g Prot in the model control, though the change is not statistically significant (Tukey p = 0.0673).</w:t>
       </w:r>
     </w:p>
     <w:p>
@@ -1937,7 +3407,21 @@
           <w:color w:val="000000"/>
           <w:sz w:val="24"/>
         </w:rPr>
-        <w:t>Administration of the clove extract does not restore these antioxidant enzyme activities. The superoxide dismutase activity in the treated group is 1.0846 U/g Prot, which is lower than the model group. Glutathione peroxidase activity in the treated group is 1.5340 U/g Prot, also showing a significant reduction compared to the model control level of 2.1189 U/g Prot. The malondialdehyde concentration in the clove group increases to 0.4788 mol/g Prot, indicating lipid peroxidation. Ibuprofen treatment successfully lowers the malondialdehyde concentration to 0.0578 mol/g Prot.</w:t>
+        <w:t>Administration of the clove extract does not restore these antioxidant enzyme activities. The superoxide dismutase activity in the treated group is 1.0846 U/g Prot, which is lower than the model group (Tukey p = 0.1845). Glutathione peroxidase activity in the treated group is 1.5340 U/g Prot, also lower than the model control level of 2.1189 U/g Prot (Tukey p = 0.0859). The malondialdehyde concentration in the clove group increases to 0.4788 mol/g Prot, showing a trend toward lipid peroxidation.</w:t>
+      </w:r>
+    </w:p>
+    <w:p>
+      <w:pPr>
+        <w:spacing w:line="360" w:lineRule="auto" w:after="0"/>
+        <w:jc w:val="both"/>
+      </w:pPr>
+      <w:r>
+        <w:rPr>
+          <w:rFonts w:ascii="Times New Roman" w:hAnsi="Times New Roman" w:eastAsia="Times New Roman"/>
+          <w:color w:val="000000"/>
+          <w:sz w:val="24"/>
+        </w:rPr>
+        <w:t>Direct comparison between the clove extract and the reference standard Ibuprofen (CL vs. IB) shows no statistically significant difference across all seven parameters. For example, the p-value is 0.4552 for SOD, 0.6778 for CAT, and 0.1013 for MDA. While Ibuprofen numerically reduces malondialdehyde levels (0.0578 mol/g Prot) compared to the clove extract (0.4788 mol/g Prot), the difference does not reach statistical significance after correcting for multiple comparisons.</w:t>
       </w:r>
     </w:p>
     <w:p>
@@ -2020,7 +3504,21 @@
           <w:color w:val="000000"/>
           <w:sz w:val="24"/>
         </w:rPr>
-        <w:t>Bay leaf assay mean values are displayed in the bar chart above. All comparisons in this assay are statistically non-significant. The mean superoxide dismutase activity of the normal group is 1.3069 U/g Prot, whereas the model group is 1.4010 U/g Prot. The mean catalase activity of the normal group is 0.3285 U/g Prot compared to 0.4533 U/g Prot in the model group. The standard deviations and standard errors are large relative to the differences between the group means, which prevents the detection of statistically significant changes.</w:t>
+        <w:t>Bay leaf assay mean values are displayed in the bar chart above. All comparisons in this assay are statistically non-significant. The mean superoxide dismutase activity of the normal group is 1.3069 U/g Prot, whereas the model group is 1.4010 U/g Prot (Tukey p = 0.9979). The mean catalase activity of the normal group is 0.3285 U/g Prot compared to 0.4533 U/g Prot in the model group (Tukey p = 0.9165).</w:t>
+      </w:r>
+    </w:p>
+    <w:p>
+      <w:pPr>
+        <w:spacing w:line="360" w:lineRule="auto" w:after="0"/>
+        <w:jc w:val="both"/>
+      </w:pPr>
+      <w:r>
+        <w:rPr>
+          <w:rFonts w:ascii="Times New Roman" w:hAnsi="Times New Roman" w:eastAsia="Times New Roman"/>
+          <w:color w:val="000000"/>
+          <w:sz w:val="24"/>
+        </w:rPr>
+        <w:t>The administration of the bay leaf extract and the reference standard Ibuprofen fails to produce statistically significant alterations compared to the model control. Furthermore, direct comparison between the bay leaf extract and Ibuprofen (BL vs. IBU) reveals no significant difference across all parameters (Tukey p &gt; 0.95 for all markers, including p = 0.9849 for SOD, p = 0.9842 for CAT, and p = 0.9839 for MDA). The baseline levels of enzymes and MDA remain statistically stable across all experimental cohorts in this study.</w:t>
       </w:r>
     </w:p>
     <w:p>

</xml_diff>

<commit_message>
Refactor: remove underpowered Clove group from Bay Leaf Assay
</commit_message>
<xml_diff>
--- a/cleaning/VISUALIZATION_EXPLANATIONS.docx
+++ b/cleaning/VISUALIZATION_EXPLANATIONS.docx
@@ -2271,153 +2271,6 @@
                 <w:color w:val="000000"/>
                 <w:sz w:val="22"/>
               </w:rPr>
-              <w:t>CL (Clove Extract)</w:t>
-            </w:r>
-          </w:p>
-        </w:tc>
-        <w:tc>
-          <w:tcPr>
-            <w:tcW w:type="dxa" w:w="1183"/>
-          </w:tcPr>
-          <w:p>
-            <w:pPr>
-              <w:jc w:val="center"/>
-            </w:pPr>
-            <w:r>
-              <w:rPr>
-                <w:rFonts w:ascii="Times New Roman" w:hAnsi="Times New Roman" w:eastAsia="Times New Roman"/>
-                <w:color w:val="000000"/>
-                <w:sz w:val="22"/>
-              </w:rPr>
-              <w:t>1.1504 ± 0.2566</w:t>
-            </w:r>
-          </w:p>
-        </w:tc>
-        <w:tc>
-          <w:tcPr>
-            <w:tcW w:type="dxa" w:w="1183"/>
-          </w:tcPr>
-          <w:p>
-            <w:pPr>
-              <w:jc w:val="center"/>
-            </w:pPr>
-            <w:r>
-              <w:rPr>
-                <w:rFonts w:ascii="Times New Roman" w:hAnsi="Times New Roman" w:eastAsia="Times New Roman"/>
-                <w:color w:val="000000"/>
-                <w:sz w:val="22"/>
-              </w:rPr>
-              <w:t>1.6703 ± 0.3716</w:t>
-            </w:r>
-          </w:p>
-        </w:tc>
-        <w:tc>
-          <w:tcPr>
-            <w:tcW w:type="dxa" w:w="1183"/>
-          </w:tcPr>
-          <w:p>
-            <w:pPr>
-              <w:jc w:val="center"/>
-            </w:pPr>
-            <w:r>
-              <w:rPr>
-                <w:rFonts w:ascii="Times New Roman" w:hAnsi="Times New Roman" w:eastAsia="Times New Roman"/>
-                <w:color w:val="000000"/>
-                <w:sz w:val="22"/>
-              </w:rPr>
-              <w:t>0.5725 ± 0.0648</w:t>
-            </w:r>
-          </w:p>
-        </w:tc>
-        <w:tc>
-          <w:tcPr>
-            <w:tcW w:type="dxa" w:w="1183"/>
-          </w:tcPr>
-          <w:p>
-            <w:pPr>
-              <w:jc w:val="center"/>
-            </w:pPr>
-            <w:r>
-              <w:rPr>
-                <w:rFonts w:ascii="Times New Roman" w:hAnsi="Times New Roman" w:eastAsia="Times New Roman"/>
-                <w:color w:val="000000"/>
-                <w:sz w:val="22"/>
-              </w:rPr>
-              <w:t>1.7265 ± 0.3234</w:t>
-            </w:r>
-          </w:p>
-        </w:tc>
-        <w:tc>
-          <w:tcPr>
-            <w:tcW w:type="dxa" w:w="1183"/>
-          </w:tcPr>
-          <w:p>
-            <w:pPr>
-              <w:jc w:val="center"/>
-            </w:pPr>
-            <w:r>
-              <w:rPr>
-                <w:rFonts w:ascii="Times New Roman" w:hAnsi="Times New Roman" w:eastAsia="Times New Roman"/>
-                <w:color w:val="000000"/>
-                <w:sz w:val="22"/>
-              </w:rPr>
-              <w:t>0.2082 ± 0.0565</w:t>
-            </w:r>
-          </w:p>
-        </w:tc>
-        <w:tc>
-          <w:tcPr>
-            <w:tcW w:type="dxa" w:w="1183"/>
-          </w:tcPr>
-          <w:p>
-            <w:pPr>
-              <w:jc w:val="center"/>
-            </w:pPr>
-            <w:r>
-              <w:rPr>
-                <w:rFonts w:ascii="Times New Roman" w:hAnsi="Times New Roman" w:eastAsia="Times New Roman"/>
-                <w:color w:val="000000"/>
-                <w:sz w:val="22"/>
-              </w:rPr>
-              <w:t>69.1803 ± 0.9836</w:t>
-            </w:r>
-          </w:p>
-        </w:tc>
-        <w:tc>
-          <w:tcPr>
-            <w:tcW w:type="dxa" w:w="1183"/>
-          </w:tcPr>
-          <w:p>
-            <w:pPr>
-              <w:jc w:val="center"/>
-            </w:pPr>
-            <w:r>
-              <w:rPr>
-                <w:rFonts w:ascii="Times New Roman" w:hAnsi="Times New Roman" w:eastAsia="Times New Roman"/>
-                <w:color w:val="000000"/>
-                <w:sz w:val="22"/>
-              </w:rPr>
-              <w:t>20.4797 ± 5.2768</w:t>
-            </w:r>
-          </w:p>
-        </w:tc>
-      </w:tr>
-      <w:tr>
-        <w:tc>
-          <w:tcPr>
-            <w:tcW w:type="dxa" w:w="1183"/>
-          </w:tcPr>
-          <w:p>
-            <w:pPr>
-              <w:jc w:val="center"/>
-            </w:pPr>
-            <w:r>
-              <w:rPr>
-                <w:rFonts w:ascii="Times New Roman" w:hAnsi="Times New Roman" w:eastAsia="Times New Roman"/>
-                <w:b/>
-                <w:color w:val="000000"/>
-                <w:sz w:val="22"/>
-              </w:rPr>
               <w:t>p-value (MG vs NG)</w:t>
             </w:r>
           </w:p>
@@ -2436,7 +2289,7 @@
                 <w:color w:val="000000"/>
                 <w:sz w:val="22"/>
               </w:rPr>
-              <w:t>0.9971 (ns)</w:t>
+              <w:t>0.9866 (ns)</w:t>
             </w:r>
           </w:p>
         </w:tc>
@@ -2454,7 +2307,7 @@
                 <w:color w:val="000000"/>
                 <w:sz w:val="22"/>
               </w:rPr>
-              <w:t>0.9979 (ns)</w:t>
+              <w:t>0.9887 (ns)</w:t>
             </w:r>
           </w:p>
         </w:tc>
@@ -2472,7 +2325,7 @@
                 <w:color w:val="000000"/>
                 <w:sz w:val="22"/>
               </w:rPr>
-              <w:t>0.9165 (ns)</w:t>
+              <w:t>0.8443 (ns)</w:t>
             </w:r>
           </w:p>
         </w:tc>
@@ -2490,25 +2343,7 @@
                 <w:color w:val="000000"/>
                 <w:sz w:val="22"/>
               </w:rPr>
-              <w:t>0.9957 (ns)</w:t>
-            </w:r>
-          </w:p>
-        </w:tc>
-        <w:tc>
-          <w:tcPr>
-            <w:tcW w:type="dxa" w:w="1183"/>
-          </w:tcPr>
-          <w:p>
-            <w:pPr>
-              <w:jc w:val="center"/>
-            </w:pPr>
-            <w:r>
-              <w:rPr>
-                <w:rFonts w:ascii="Times New Roman" w:hAnsi="Times New Roman" w:eastAsia="Times New Roman"/>
-                <w:color w:val="000000"/>
-                <w:sz w:val="22"/>
-              </w:rPr>
-              <w:t>1.0000 (ns)</w:t>
+              <w:t>0.9821 (ns)</w:t>
             </w:r>
           </w:p>
         </w:tc>
@@ -2544,7 +2379,25 @@
                 <w:color w:val="000000"/>
                 <w:sz w:val="22"/>
               </w:rPr>
-              <w:t>0.9873 (ns)</w:t>
+              <w:t>0.9985 (ns)</w:t>
+            </w:r>
+          </w:p>
+        </w:tc>
+        <w:tc>
+          <w:tcPr>
+            <w:tcW w:type="dxa" w:w="1183"/>
+          </w:tcPr>
+          <w:p>
+            <w:pPr>
+              <w:jc w:val="center"/>
+            </w:pPr>
+            <w:r>
+              <w:rPr>
+                <w:rFonts w:ascii="Times New Roman" w:hAnsi="Times New Roman" w:eastAsia="Times New Roman"/>
+                <w:color w:val="000000"/>
+                <w:sz w:val="22"/>
+              </w:rPr>
+              <w:t>0.9535 (ns)</w:t>
             </w:r>
           </w:p>
         </w:tc>
@@ -2583,7 +2436,7 @@
                 <w:color w:val="000000"/>
                 <w:sz w:val="22"/>
               </w:rPr>
-              <w:t>0.7548 (ns)</w:t>
+              <w:t>0.6331 (ns)</w:t>
             </w:r>
           </w:p>
         </w:tc>
@@ -2601,7 +2454,7 @@
                 <w:color w:val="000000"/>
                 <w:sz w:val="22"/>
               </w:rPr>
-              <w:t>0.9243 (ns)</w:t>
+              <w:t>0.8388 (ns)</w:t>
             </w:r>
           </w:p>
         </w:tc>
@@ -2619,7 +2472,7 @@
                 <w:color w:val="000000"/>
                 <w:sz w:val="22"/>
               </w:rPr>
-              <w:t>0.9043 (ns)</w:t>
+              <w:t>0.8275 (ns)</w:t>
             </w:r>
           </w:p>
         </w:tc>
@@ -2637,7 +2490,7 @@
                 <w:color w:val="000000"/>
                 <w:sz w:val="22"/>
               </w:rPr>
-              <w:t>0.3864 (ns)</w:t>
+              <w:t>0.2866 (ns)</w:t>
             </w:r>
           </w:p>
         </w:tc>
@@ -2655,7 +2508,7 @@
                 <w:color w:val="000000"/>
                 <w:sz w:val="22"/>
               </w:rPr>
-              <w:t>0.6683 (ns)</w:t>
+              <w:t>0.5489 (ns)</w:t>
             </w:r>
           </w:p>
         </w:tc>
@@ -2673,7 +2526,7 @@
                 <w:color w:val="000000"/>
                 <w:sz w:val="22"/>
               </w:rPr>
-              <w:t>0.9985 (ns)</w:t>
+              <w:t>0.9923 (ns)</w:t>
             </w:r>
           </w:p>
         </w:tc>
@@ -2691,7 +2544,7 @@
                 <w:color w:val="000000"/>
                 <w:sz w:val="22"/>
               </w:rPr>
-              <w:t>0.9986 (ns)</w:t>
+              <w:t>0.9909 (ns)</w:t>
             </w:r>
           </w:p>
         </w:tc>
@@ -2730,7 +2583,7 @@
                 <w:color w:val="000000"/>
                 <w:sz w:val="22"/>
               </w:rPr>
-              <w:t>0.9955 (ns)</w:t>
+              <w:t>0.9812 (ns)</w:t>
             </w:r>
           </w:p>
         </w:tc>
@@ -2748,7 +2601,7 @@
                 <w:color w:val="000000"/>
                 <w:sz w:val="22"/>
               </w:rPr>
-              <w:t>0.9993 (ns)</w:t>
+              <w:t>0.9953 (ns)</w:t>
             </w:r>
           </w:p>
         </w:tc>
@@ -2766,7 +2619,7 @@
                 <w:color w:val="000000"/>
                 <w:sz w:val="22"/>
               </w:rPr>
-              <w:t>0.8153 (ns)</w:t>
+              <w:t>0.7176 (ns)</w:t>
             </w:r>
           </w:p>
         </w:tc>
@@ -2784,7 +2637,7 @@
                 <w:color w:val="000000"/>
                 <w:sz w:val="22"/>
               </w:rPr>
-              <w:t>0.6660 (ns)</w:t>
+              <w:t>0.5403 (ns)</w:t>
             </w:r>
           </w:p>
         </w:tc>
@@ -2802,7 +2655,7 @@
                 <w:color w:val="000000"/>
                 <w:sz w:val="22"/>
               </w:rPr>
-              <w:t>0.9676 (ns)</w:t>
+              <w:t>0.9199 (ns)</w:t>
             </w:r>
           </w:p>
         </w:tc>
@@ -2838,154 +2691,7 @@
                 <w:color w:val="000000"/>
                 <w:sz w:val="22"/>
               </w:rPr>
-              <w:t>0.9999 (ns)</w:t>
-            </w:r>
-          </w:p>
-        </w:tc>
-      </w:tr>
-      <w:tr>
-        <w:tc>
-          <w:tcPr>
-            <w:tcW w:type="dxa" w:w="1183"/>
-          </w:tcPr>
-          <w:p>
-            <w:pPr>
-              <w:jc w:val="center"/>
-            </w:pPr>
-            <w:r>
-              <w:rPr>
-                <w:rFonts w:ascii="Times New Roman" w:hAnsi="Times New Roman" w:eastAsia="Times New Roman"/>
-                <w:b/>
-                <w:color w:val="000000"/>
-                <w:sz w:val="22"/>
-              </w:rPr>
-              <w:t>p-value (CL vs MG)</w:t>
-            </w:r>
-          </w:p>
-        </w:tc>
-        <w:tc>
-          <w:tcPr>
-            <w:tcW w:type="dxa" w:w="1183"/>
-          </w:tcPr>
-          <w:p>
-            <w:pPr>
-              <w:jc w:val="center"/>
-            </w:pPr>
-            <w:r>
-              <w:rPr>
-                <w:rFonts w:ascii="Times New Roman" w:hAnsi="Times New Roman" w:eastAsia="Times New Roman"/>
-                <w:color w:val="000000"/>
-                <w:sz w:val="22"/>
-              </w:rPr>
-              <w:t>0.9186 (ns)</w:t>
-            </w:r>
-          </w:p>
-        </w:tc>
-        <w:tc>
-          <w:tcPr>
-            <w:tcW w:type="dxa" w:w="1183"/>
-          </w:tcPr>
-          <w:p>
-            <w:pPr>
-              <w:jc w:val="center"/>
-            </w:pPr>
-            <w:r>
-              <w:rPr>
-                <w:rFonts w:ascii="Times New Roman" w:hAnsi="Times New Roman" w:eastAsia="Times New Roman"/>
-                <w:color w:val="000000"/>
-                <w:sz w:val="22"/>
-              </w:rPr>
-              <w:t>0.9308 (ns)</w:t>
-            </w:r>
-          </w:p>
-        </w:tc>
-        <w:tc>
-          <w:tcPr>
-            <w:tcW w:type="dxa" w:w="1183"/>
-          </w:tcPr>
-          <w:p>
-            <w:pPr>
-              <w:jc w:val="center"/>
-            </w:pPr>
-            <w:r>
-              <w:rPr>
-                <w:rFonts w:ascii="Times New Roman" w:hAnsi="Times New Roman" w:eastAsia="Times New Roman"/>
-                <w:color w:val="000000"/>
-                <w:sz w:val="22"/>
-              </w:rPr>
-              <w:t>0.9511 (ns)</w:t>
-            </w:r>
-          </w:p>
-        </w:tc>
-        <w:tc>
-          <w:tcPr>
-            <w:tcW w:type="dxa" w:w="1183"/>
-          </w:tcPr>
-          <w:p>
-            <w:pPr>
-              <w:jc w:val="center"/>
-            </w:pPr>
-            <w:r>
-              <w:rPr>
-                <w:rFonts w:ascii="Times New Roman" w:hAnsi="Times New Roman" w:eastAsia="Times New Roman"/>
-                <w:color w:val="000000"/>
-                <w:sz w:val="22"/>
-              </w:rPr>
-              <w:t>0.5611 (ns)</w:t>
-            </w:r>
-          </w:p>
-        </w:tc>
-        <w:tc>
-          <w:tcPr>
-            <w:tcW w:type="dxa" w:w="1183"/>
-          </w:tcPr>
-          <w:p>
-            <w:pPr>
-              <w:jc w:val="center"/>
-            </w:pPr>
-            <w:r>
-              <w:rPr>
-                <w:rFonts w:ascii="Times New Roman" w:hAnsi="Times New Roman" w:eastAsia="Times New Roman"/>
-                <w:color w:val="000000"/>
-                <w:sz w:val="22"/>
-              </w:rPr>
-              <w:t>0.9998 (ns)</w:t>
-            </w:r>
-          </w:p>
-        </w:tc>
-        <w:tc>
-          <w:tcPr>
-            <w:tcW w:type="dxa" w:w="1183"/>
-          </w:tcPr>
-          <w:p>
-            <w:pPr>
-              <w:jc w:val="center"/>
-            </w:pPr>
-            <w:r>
-              <w:rPr>
-                <w:rFonts w:ascii="Times New Roman" w:hAnsi="Times New Roman" w:eastAsia="Times New Roman"/>
-                <w:color w:val="000000"/>
-                <w:sz w:val="22"/>
-              </w:rPr>
-              <w:t>1.0000 (ns)</w:t>
-            </w:r>
-          </w:p>
-        </w:tc>
-        <w:tc>
-          <w:tcPr>
-            <w:tcW w:type="dxa" w:w="1183"/>
-          </w:tcPr>
-          <w:p>
-            <w:pPr>
-              <w:jc w:val="center"/>
-            </w:pPr>
-            <w:r>
-              <w:rPr>
-                <w:rFonts w:ascii="Times New Roman" w:hAnsi="Times New Roman" w:eastAsia="Times New Roman"/>
-                <w:color w:val="000000"/>
-                <w:sz w:val="22"/>
-              </w:rPr>
-              <w:t>0.9027 (ns)</w:t>
+              <w:t>0.9991 (ns)</w:t>
             </w:r>
           </w:p>
         </w:tc>
@@ -3024,7 +2730,7 @@
                 <w:color w:val="000000"/>
                 <w:sz w:val="22"/>
               </w:rPr>
-              <w:t>0.9519 (ns)</w:t>
+              <w:t>0.8903 (ns)</w:t>
             </w:r>
           </w:p>
         </w:tc>
@@ -3042,7 +2748,7 @@
                 <w:color w:val="000000"/>
                 <w:sz w:val="22"/>
               </w:rPr>
-              <w:t>0.9849 (ns)</w:t>
+              <w:t>0.9512 (ns)</w:t>
             </w:r>
           </w:p>
         </w:tc>
@@ -3060,7 +2766,7 @@
                 <w:color w:val="000000"/>
                 <w:sz w:val="22"/>
               </w:rPr>
-              <w:t>0.9842 (ns)</w:t>
+              <w:t>0.9553 (ns)</w:t>
             </w:r>
           </w:p>
         </w:tc>
@@ -3078,7 +2784,7 @@
                 <w:color w:val="000000"/>
                 <w:sz w:val="22"/>
               </w:rPr>
-              <w:t>1.0000 (ns)</w:t>
+              <w:t>0.9998 (ns)</w:t>
             </w:r>
           </w:p>
         </w:tc>
@@ -3096,7 +2802,7 @@
                 <w:color w:val="000000"/>
                 <w:sz w:val="22"/>
               </w:rPr>
-              <w:t>0.9839 (ns)</w:t>
+              <w:t>0.9526 (ns)</w:t>
             </w:r>
           </w:p>
         </w:tc>
@@ -3114,7 +2820,7 @@
                 <w:color w:val="000000"/>
                 <w:sz w:val="22"/>
               </w:rPr>
-              <w:t>0.9980 (ns)</w:t>
+              <w:t>0.9905 (ns)</w:t>
             </w:r>
           </w:p>
         </w:tc>
@@ -3132,154 +2838,7 @@
                 <w:color w:val="000000"/>
                 <w:sz w:val="22"/>
               </w:rPr>
-              <w:t>0.9914 (ns)</w:t>
-            </w:r>
-          </w:p>
-        </w:tc>
-      </w:tr>
-      <w:tr>
-        <w:tc>
-          <w:tcPr>
-            <w:tcW w:type="dxa" w:w="1183"/>
-          </w:tcPr>
-          <w:p>
-            <w:pPr>
-              <w:jc w:val="center"/>
-            </w:pPr>
-            <w:r>
-              <w:rPr>
-                <w:rFonts w:ascii="Times New Roman" w:hAnsi="Times New Roman" w:eastAsia="Times New Roman"/>
-                <w:b/>
-                <w:color w:val="000000"/>
-                <w:sz w:val="22"/>
-              </w:rPr>
-              <w:t>p-value (CL vs IBU)</w:t>
-            </w:r>
-          </w:p>
-        </w:tc>
-        <w:tc>
-          <w:tcPr>
-            <w:tcW w:type="dxa" w:w="1183"/>
-          </w:tcPr>
-          <w:p>
-            <w:pPr>
-              <w:jc w:val="center"/>
-            </w:pPr>
-            <w:r>
-              <w:rPr>
-                <w:rFonts w:ascii="Times New Roman" w:hAnsi="Times New Roman" w:eastAsia="Times New Roman"/>
-                <w:color w:val="000000"/>
-                <w:sz w:val="22"/>
-              </w:rPr>
-              <w:t>0.9871 (ns)</w:t>
-            </w:r>
-          </w:p>
-        </w:tc>
-        <w:tc>
-          <w:tcPr>
-            <w:tcW w:type="dxa" w:w="1183"/>
-          </w:tcPr>
-          <w:p>
-            <w:pPr>
-              <w:jc w:val="center"/>
-            </w:pPr>
-            <w:r>
-              <w:rPr>
-                <w:rFonts w:ascii="Times New Roman" w:hAnsi="Times New Roman" w:eastAsia="Times New Roman"/>
-                <w:color w:val="000000"/>
-                <w:sz w:val="22"/>
-              </w:rPr>
-              <w:t>0.9759 (ns)</w:t>
-            </w:r>
-          </w:p>
-        </w:tc>
-        <w:tc>
-          <w:tcPr>
-            <w:tcW w:type="dxa" w:w="1183"/>
-          </w:tcPr>
-          <w:p>
-            <w:pPr>
-              <w:jc w:val="center"/>
-            </w:pPr>
-            <w:r>
-              <w:rPr>
-                <w:rFonts w:ascii="Times New Roman" w:hAnsi="Times New Roman" w:eastAsia="Times New Roman"/>
-                <w:color w:val="000000"/>
-                <w:sz w:val="22"/>
-              </w:rPr>
-              <w:t>0.9990 (ns)</w:t>
-            </w:r>
-          </w:p>
-        </w:tc>
-        <w:tc>
-          <w:tcPr>
-            <w:tcW w:type="dxa" w:w="1183"/>
-          </w:tcPr>
-          <w:p>
-            <w:pPr>
-              <w:jc w:val="center"/>
-            </w:pPr>
-            <w:r>
-              <w:rPr>
-                <w:rFonts w:ascii="Times New Roman" w:hAnsi="Times New Roman" w:eastAsia="Times New Roman"/>
-                <w:color w:val="000000"/>
-                <w:sz w:val="22"/>
-              </w:rPr>
-              <w:t>0.9977 (ns)</w:t>
-            </w:r>
-          </w:p>
-        </w:tc>
-        <w:tc>
-          <w:tcPr>
-            <w:tcW w:type="dxa" w:w="1183"/>
-          </w:tcPr>
-          <w:p>
-            <w:pPr>
-              <w:jc w:val="center"/>
-            </w:pPr>
-            <w:r>
-              <w:rPr>
-                <w:rFonts w:ascii="Times New Roman" w:hAnsi="Times New Roman" w:eastAsia="Times New Roman"/>
-                <w:color w:val="000000"/>
-                <w:sz w:val="22"/>
-              </w:rPr>
-              <w:t>0.9947 (ns)</w:t>
-            </w:r>
-          </w:p>
-        </w:tc>
-        <w:tc>
-          <w:tcPr>
-            <w:tcW w:type="dxa" w:w="1183"/>
-          </w:tcPr>
-          <w:p>
-            <w:pPr>
-              <w:jc w:val="center"/>
-            </w:pPr>
-            <w:r>
-              <w:rPr>
-                <w:rFonts w:ascii="Times New Roman" w:hAnsi="Times New Roman" w:eastAsia="Times New Roman"/>
-                <w:color w:val="000000"/>
-                <w:sz w:val="22"/>
-              </w:rPr>
-              <w:t>1.0000 (ns)</w:t>
-            </w:r>
-          </w:p>
-        </w:tc>
-        <w:tc>
-          <w:tcPr>
-            <w:tcW w:type="dxa" w:w="1183"/>
-          </w:tcPr>
-          <w:p>
-            <w:pPr>
-              <w:jc w:val="center"/>
-            </w:pPr>
-            <w:r>
-              <w:rPr>
-                <w:rFonts w:ascii="Times New Roman" w:hAnsi="Times New Roman" w:eastAsia="Times New Roman"/>
-                <w:color w:val="000000"/>
-                <w:sz w:val="22"/>
-              </w:rPr>
-              <w:t>0.8568 (ns)</w:t>
+              <w:t>0.9651 (ns)</w:t>
             </w:r>
           </w:p>
         </w:tc>
@@ -3504,7 +3063,7 @@
           <w:color w:val="000000"/>
           <w:sz w:val="24"/>
         </w:rPr>
-        <w:t>Bay leaf assay mean values are displayed in the bar chart above. All comparisons in this assay are statistically non-significant. The mean superoxide dismutase activity of the normal group is 1.3069 U/g Prot, whereas the model group is 1.4010 U/g Prot (Tukey p = 0.9979). The mean catalase activity of the normal group is 0.3285 U/g Prot compared to 0.4533 U/g Prot in the model group (Tukey p = 0.9165).</w:t>
+        <w:t>Bay leaf assay mean values are displayed in the bar chart above. All comparisons in this assay are statistically non-significant. The mean superoxide dismutase activity of the normal group is 1.3069 U/g Prot, whereas the model group is 1.4010 U/g Prot (Tukey p = 0.9887). The mean catalase activity of the normal group is 0.3285 U/g Prot compared to 0.4533 U/g Prot in the model group (Tukey p = 0.8443).</w:t>
       </w:r>
     </w:p>
     <w:p>
@@ -3518,7 +3077,7 @@
           <w:color w:val="000000"/>
           <w:sz w:val="24"/>
         </w:rPr>
-        <w:t>The administration of the bay leaf extract and the reference standard Ibuprofen fails to produce statistically significant alterations compared to the model control. Furthermore, direct comparison between the bay leaf extract and Ibuprofen (BL vs. IBU) reveals no significant difference across all parameters (Tukey p &gt; 0.95 for all markers, including p = 0.9849 for SOD, p = 0.9842 for CAT, and p = 0.9839 for MDA). The baseline levels of enzymes and MDA remain statistically stable across all experimental cohorts in this study.</w:t>
+        <w:t>The administration of the bay leaf extract and the reference standard Ibuprofen fails to produce statistically significant alterations compared to the model control. Furthermore, direct comparison between the bay leaf extract and Ibuprofen (BL vs. IBU) reveals no significant difference across all parameters (Tukey p &gt; 0.89 for all markers, including p = 0.9512 for SOD, p = 0.9553 for CAT, and p = 0.9526 for MDA). The baseline levels of enzymes and MDA remain statistically stable across all experimental cohorts in this study.</w:t>
       </w:r>
     </w:p>
     <w:p>
@@ -3626,7 +3185,7 @@
       <w:r>
         <w:drawing>
           <wp:inline xmlns:a="http://schemas.openxmlformats.org/drawingml/2006/main" xmlns:pic="http://schemas.openxmlformats.org/drawingml/2006/picture">
-            <wp:extent cx="4114800" cy="2743200"/>
+            <wp:extent cx="4114800" cy="3086100"/>
             <wp:docPr id="4" name="Picture 4"/>
             <wp:cNvGraphicFramePr>
               <a:graphicFrameLocks noChangeAspect="1"/>
@@ -3647,7 +3206,7 @@
                   <pic:spPr>
                     <a:xfrm>
                       <a:off x="0" y="0"/>
-                      <a:ext cx="4114800" cy="2743200"/>
+                      <a:ext cx="4114800" cy="3086100"/>
                     </a:xfrm>
                     <a:prstGeom prst="rect"/>
                   </pic:spPr>
@@ -3778,7 +3337,7 @@
       <w:r>
         <w:drawing>
           <wp:inline xmlns:a="http://schemas.openxmlformats.org/drawingml/2006/main" xmlns:pic="http://schemas.openxmlformats.org/drawingml/2006/picture">
-            <wp:extent cx="4114800" cy="2743200"/>
+            <wp:extent cx="4114800" cy="3086100"/>
             <wp:docPr id="6" name="Picture 6"/>
             <wp:cNvGraphicFramePr>
               <a:graphicFrameLocks noChangeAspect="1"/>
@@ -3799,7 +3358,7 @@
                   <pic:spPr>
                     <a:xfrm>
                       <a:off x="0" y="0"/>
-                      <a:ext cx="4114800" cy="2743200"/>
+                      <a:ext cx="4114800" cy="3086100"/>
                     </a:xfrm>
                     <a:prstGeom prst="rect"/>
                   </pic:spPr>

</xml_diff>